<commit_message>
Use R2025a agentic toolkits for Simulink model
</commit_message>
<xml_diff>
--- a/output/doc/PPT制作说明书.docx
+++ b/output/doc/PPT制作说明书.docx
@@ -3,9 +3,12 @@
 <w:document xmlns:wpc="http://schemas.microsoft.com/office/word/2010/wordprocessingCanvas" xmlns:mo="http://schemas.microsoft.com/office/mac/office/2008/main" xmlns:mc="http://schemas.openxmlformats.org/markup-compatibility/2006" xmlns:mv="urn:schemas-microsoft-com:mac:vml" xmlns:o="urn:schemas-microsoft-com:office:office" xmlns:r="http://schemas.openxmlformats.org/officeDocument/2006/relationships" xmlns:m="http://schemas.openxmlformats.org/officeDocument/2006/math" xmlns:v="urn:schemas-microsoft-com:vml" xmlns:wp14="http://schemas.microsoft.com/office/word/2010/wordprocessingDrawing" xmlns:wp="http://schemas.openxmlformats.org/drawingml/2006/wordprocessingDrawing" xmlns:w10="urn:schemas-microsoft-com:office:word" xmlns:w="http://schemas.openxmlformats.org/wordprocessingml/2006/main" xmlns:w14="http://schemas.microsoft.com/office/word/2010/wordml" xmlns:wpg="http://schemas.microsoft.com/office/word/2010/wordprocessingGroup" xmlns:wpi="http://schemas.microsoft.com/office/word/2010/wordprocessingInk" xmlns:wne="http://schemas.microsoft.com/office/word/2006/wordml" xmlns:wps="http://schemas.microsoft.com/office/word/2010/wordprocessingShape" mc:Ignorable="w14 wp14">
   <w:body>
     <w:p>
+      <w:pPr>
+        <w:jc w:val="center"/>
+      </w:pPr>
       <w:r>
         <w:rPr>
-          <w:rFonts w:ascii="Times New Roman" w:hAnsi="Times New Roman" w:eastAsia="??"/>
+          <w:rFonts w:ascii="Times New Roman" w:hAnsi="Times New Roman" w:eastAsia="宋体"/>
           <w:b/>
           <w:sz w:val="36"/>
         </w:rPr>
@@ -13,112 +16,164 @@
       </w:r>
     </w:p>
     <w:p>
+      <w:pPr>
+        <w:spacing w:before="160"/>
+      </w:pPr>
       <w:r>
         <w:rPr>
-          <w:rFonts w:ascii="Times New Roman" w:hAnsi="Times New Roman" w:eastAsia="??"/>
+          <w:rFonts w:ascii="Times New Roman" w:hAnsi="Times New Roman" w:eastAsia="宋体"/>
           <w:b/>
-          <w:sz w:val="30"/>
+          <w:sz w:val="28"/>
         </w:rPr>
         <w:t>1. 给PPT制作者的总要求</w:t>
       </w:r>
     </w:p>
     <w:p>
+      <w:pPr>
+        <w:spacing w:line="324" w:lineRule="auto" w:after="80"/>
+        <w:ind w:firstLine="440"/>
+      </w:pPr>
       <w:r>
         <w:rPr>
-          <w:rFonts w:ascii="Times New Roman" w:hAnsi="Times New Roman" w:eastAsia="??"/>
+          <w:rFonts w:ascii="Times New Roman" w:hAnsi="Times New Roman" w:eastAsia="宋体"/>
+          <w:b w:val="0"/>
           <w:sz w:val="22"/>
         </w:rPr>
-        <w:t>这份PPT要讲清楚一件事：本设计不是单独做电机、视频或射频，而是把机器人端的驱动控制、视频采集和无线通信放在同一个系统里，用 MATLAB/Simulink 建模，并用真实仿真结果证明方案在软件模型中是自洽的。</w:t>
+        <w:t>这份PPT要讲清楚一件事：本设计不是单独做电机、视频或射频，而是把机器人端的驱动控制、视频采集和无线通信放在同一个系统里，用 MATLAB R2025a/Simulink 建模，并用真实仿真结果证明方案在软件模型中是自洽的。</w:t>
       </w:r>
     </w:p>
     <w:p>
+      <w:pPr>
+        <w:spacing w:line="324" w:lineRule="auto" w:after="80"/>
+        <w:ind w:firstLine="440"/>
+      </w:pPr>
       <w:r>
         <w:rPr>
-          <w:rFonts w:ascii="Times New Roman" w:hAnsi="Times New Roman" w:eastAsia="??"/>
+          <w:rFonts w:ascii="Times New Roman" w:hAnsi="Times New Roman" w:eastAsia="宋体"/>
+          <w:b w:val="0"/>
           <w:sz w:val="22"/>
         </w:rPr>
         <w:t>PPT不要堆大段文字。每页只讲一个重点，尽量用“图 + 3条解释”的方式呈现。听众是初学者，所以要先解释系统为什么这样分，再解释每个模块做什么，最后再看仿真数据说明效果。</w:t>
       </w:r>
     </w:p>
     <w:p>
+      <w:pPr>
+        <w:spacing w:line="324" w:lineRule="auto" w:after="80"/>
+        <w:ind w:firstLine="440"/>
+      </w:pPr>
       <w:r>
         <w:rPr>
-          <w:rFonts w:ascii="Times New Roman" w:hAnsi="Times New Roman" w:eastAsia="??"/>
+          <w:rFonts w:ascii="Times New Roman" w:hAnsi="Times New Roman" w:eastAsia="宋体"/>
+          <w:b w:val="0"/>
           <w:sz w:val="22"/>
         </w:rPr>
         <w:t>报告中所有图都在 `output/figures/`。优先使用这些图，不要重新截图模糊图片。</w:t>
       </w:r>
     </w:p>
     <w:p>
+      <w:pPr>
+        <w:spacing w:before="160"/>
+      </w:pPr>
       <w:r>
         <w:rPr>
-          <w:rFonts w:ascii="Times New Roman" w:hAnsi="Times New Roman" w:eastAsia="??"/>
+          <w:rFonts w:ascii="Times New Roman" w:hAnsi="Times New Roman" w:eastAsia="宋体"/>
           <w:b/>
-          <w:sz w:val="30"/>
+          <w:sz w:val="28"/>
         </w:rPr>
         <w:t>2. 推荐PPT结构</w:t>
       </w:r>
     </w:p>
     <w:p>
+      <w:pPr>
+        <w:spacing w:before="120"/>
+      </w:pPr>
       <w:r>
         <w:rPr>
-          <w:rFonts w:ascii="Times New Roman" w:hAnsi="Times New Roman" w:eastAsia="??"/>
+          <w:rFonts w:ascii="Times New Roman" w:hAnsi="Times New Roman" w:eastAsia="宋体"/>
           <w:b/>
-          <w:sz w:val="26"/>
+          <w:sz w:val="25"/>
         </w:rPr>
         <w:t>第1页：标题页</w:t>
       </w:r>
     </w:p>
     <w:p>
+      <w:pPr>
+        <w:spacing w:line="324" w:lineRule="auto" w:after="80"/>
+        <w:ind w:firstLine="440"/>
+      </w:pPr>
       <w:r>
         <w:rPr>
-          <w:rFonts w:ascii="Times New Roman" w:hAnsi="Times New Roman" w:eastAsia="??"/>
+          <w:rFonts w:ascii="Times New Roman" w:hAnsi="Times New Roman" w:eastAsia="宋体"/>
+          <w:b w:val="0"/>
           <w:sz w:val="22"/>
         </w:rPr>
         <w:t>标题：基于 MATLAB/Simulink 的机器人端无线控制系统设计</w:t>
       </w:r>
     </w:p>
     <w:p>
+      <w:pPr>
+        <w:spacing w:line="324" w:lineRule="auto" w:after="80"/>
+        <w:ind w:firstLine="440"/>
+      </w:pPr>
       <w:r>
         <w:rPr>
-          <w:rFonts w:ascii="Times New Roman" w:hAnsi="Times New Roman" w:eastAsia="??"/>
+          <w:rFonts w:ascii="Times New Roman" w:hAnsi="Times New Roman" w:eastAsia="宋体"/>
+          <w:b w:val="0"/>
           <w:sz w:val="22"/>
         </w:rPr>
         <w:t>包含：课程名称、姓名、班级、指导老师、日期。缺失信息用“待填写”。</w:t>
       </w:r>
     </w:p>
     <w:p>
+      <w:pPr>
+        <w:spacing w:line="324" w:lineRule="auto" w:after="80"/>
+        <w:ind w:firstLine="440"/>
+      </w:pPr>
       <w:r>
         <w:rPr>
-          <w:rFonts w:ascii="Times New Roman" w:hAnsi="Times New Roman" w:eastAsia="??"/>
+          <w:rFonts w:ascii="Times New Roman" w:hAnsi="Times New Roman" w:eastAsia="宋体"/>
+          <w:b w:val="0"/>
           <w:sz w:val="22"/>
         </w:rPr>
         <w:t>讲述重点：这是一个机器人端远程无线控制系统设计，不是单纯电机控制实验。</w:t>
       </w:r>
     </w:p>
     <w:p>
+      <w:pPr>
+        <w:spacing w:before="120"/>
+      </w:pPr>
       <w:r>
         <w:rPr>
-          <w:rFonts w:ascii="Times New Roman" w:hAnsi="Times New Roman" w:eastAsia="??"/>
+          <w:rFonts w:ascii="Times New Roman" w:hAnsi="Times New Roman" w:eastAsia="宋体"/>
           <w:b/>
-          <w:sz w:val="26"/>
+          <w:sz w:val="25"/>
         </w:rPr>
         <w:t>第2页：任务背景和设计目标</w:t>
       </w:r>
     </w:p>
     <w:p>
+      <w:pPr>
+        <w:spacing w:line="324" w:lineRule="auto" w:after="80"/>
+        <w:ind w:firstLine="440"/>
+      </w:pPr>
       <w:r>
         <w:rPr>
-          <w:rFonts w:ascii="Times New Roman" w:hAnsi="Times New Roman" w:eastAsia="??"/>
+          <w:rFonts w:ascii="Times New Roman" w:hAnsi="Times New Roman" w:eastAsia="宋体"/>
+          <w:b w:val="0"/>
           <w:sz w:val="22"/>
         </w:rPr>
         <w:t>建议放图：`system_architecture.png`</w:t>
       </w:r>
     </w:p>
     <w:p>
+      <w:pPr>
+        <w:spacing w:line="324" w:lineRule="auto" w:after="80"/>
+        <w:ind w:firstLine="440"/>
+      </w:pPr>
       <w:r>
         <w:rPr>
-          <w:rFonts w:ascii="Times New Roman" w:hAnsi="Times New Roman" w:eastAsia="??"/>
+          <w:rFonts w:ascii="Times New Roman" w:hAnsi="Times New Roman" w:eastAsia="宋体"/>
+          <w:b w:val="0"/>
           <w:sz w:val="22"/>
         </w:rPr>
         <w:t>讲清楚三句话：</w:t>
@@ -127,10 +182,12 @@
     <w:p>
       <w:pPr>
         <w:pStyle w:val="ListBullet"/>
+        <w:spacing w:line="324" w:lineRule="auto" w:after="80"/>
       </w:pPr>
       <w:r>
         <w:rPr>
-          <w:rFonts w:ascii="Times New Roman" w:hAnsi="Times New Roman" w:eastAsia="??"/>
+          <w:rFonts w:ascii="Times New Roman" w:hAnsi="Times New Roman" w:eastAsia="宋体"/>
+          <w:b w:val="0"/>
           <w:sz w:val="22"/>
         </w:rPr>
         <w:t>机器人端需要接收控制命令，同时把视频信息传给远程端。</w:t>
@@ -139,10 +196,12 @@
     <w:p>
       <w:pPr>
         <w:pStyle w:val="ListBullet"/>
+        <w:spacing w:line="324" w:lineRule="auto" w:after="80"/>
       </w:pPr>
       <w:r>
         <w:rPr>
-          <w:rFonts w:ascii="Times New Roman" w:hAnsi="Times New Roman" w:eastAsia="??"/>
+          <w:rFonts w:ascii="Times New Roman" w:hAnsi="Times New Roman" w:eastAsia="宋体"/>
+          <w:b w:val="0"/>
           <w:sz w:val="22"/>
         </w:rPr>
         <w:t>电机控制要求可靠、实时；视频链路要求带宽足够；射频链路要求距离和稳定性。</w:t>
@@ -151,120 +210,174 @@
     <w:p>
       <w:pPr>
         <w:pStyle w:val="ListBullet"/>
+        <w:spacing w:line="324" w:lineRule="auto" w:after="80"/>
       </w:pPr>
       <w:r>
         <w:rPr>
-          <w:rFonts w:ascii="Times New Roman" w:hAnsi="Times New Roman" w:eastAsia="??"/>
+          <w:rFonts w:ascii="Times New Roman" w:hAnsi="Times New Roman" w:eastAsia="宋体"/>
+          <w:b w:val="0"/>
           <w:sz w:val="22"/>
         </w:rPr>
-        <w:t>本设计用 MATLAB/Simulink 做系统仿真，不使用 Vitis。</w:t>
+        <w:t>本设计用 MATLAB R2025a/Simulink 做系统仿真，不使用 Vitis。</w:t>
       </w:r>
     </w:p>
     <w:p>
+      <w:pPr>
+        <w:spacing w:before="120"/>
+      </w:pPr>
       <w:r>
         <w:rPr>
-          <w:rFonts w:ascii="Times New Roman" w:hAnsi="Times New Roman" w:eastAsia="??"/>
+          <w:rFonts w:ascii="Times New Roman" w:hAnsi="Times New Roman" w:eastAsia="宋体"/>
           <w:b/>
-          <w:sz w:val="26"/>
+          <w:sz w:val="25"/>
         </w:rPr>
         <w:t>第3页：总体系统架构</w:t>
       </w:r>
     </w:p>
     <w:p>
+      <w:pPr>
+        <w:spacing w:line="324" w:lineRule="auto" w:after="80"/>
+        <w:ind w:firstLine="440"/>
+      </w:pPr>
       <w:r>
         <w:rPr>
-          <w:rFonts w:ascii="Times New Roman" w:hAnsi="Times New Roman" w:eastAsia="??"/>
+          <w:rFonts w:ascii="Times New Roman" w:hAnsi="Times New Roman" w:eastAsia="宋体"/>
+          <w:b w:val="0"/>
           <w:sz w:val="22"/>
         </w:rPr>
         <w:t>建议放图：`system_architecture.png`</w:t>
       </w:r>
     </w:p>
     <w:p>
+      <w:pPr>
+        <w:spacing w:line="324" w:lineRule="auto" w:after="80"/>
+        <w:ind w:firstLine="440"/>
+      </w:pPr>
       <w:r>
         <w:rPr>
-          <w:rFonts w:ascii="Times New Roman" w:hAnsi="Times New Roman" w:eastAsia="??"/>
+          <w:rFonts w:ascii="Times New Roman" w:hAnsi="Times New Roman" w:eastAsia="宋体"/>
+          <w:b w:val="0"/>
           <w:sz w:val="22"/>
         </w:rPr>
         <w:t>讲述逻辑：</w:t>
       </w:r>
     </w:p>
     <w:p>
+      <w:pPr>
+        <w:spacing w:line="324" w:lineRule="auto" w:after="80"/>
+      </w:pPr>
       <w:r>
         <w:rPr>
-          <w:rFonts w:ascii="Times New Roman" w:hAnsi="Times New Roman" w:eastAsia="??"/>
+          <w:rFonts w:ascii="Times New Roman" w:hAnsi="Times New Roman" w:eastAsia="宋体"/>
+          <w:b w:val="0"/>
           <w:sz w:val="22"/>
         </w:rPr>
         <w:t>1. 摄像头采集视频。</w:t>
       </w:r>
     </w:p>
     <w:p>
+      <w:pPr>
+        <w:spacing w:line="324" w:lineRule="auto" w:after="80"/>
+      </w:pPr>
       <w:r>
         <w:rPr>
-          <w:rFonts w:ascii="Times New Roman" w:hAnsi="Times New Roman" w:eastAsia="??"/>
+          <w:rFonts w:ascii="Times New Roman" w:hAnsi="Times New Roman" w:eastAsia="宋体"/>
+          <w:b w:val="0"/>
           <w:sz w:val="22"/>
         </w:rPr>
         <w:t>2. DSP 负责电机闭环控制和数据调度。</w:t>
       </w:r>
     </w:p>
     <w:p>
+      <w:pPr>
+        <w:spacing w:line="324" w:lineRule="auto" w:after="80"/>
+      </w:pPr>
       <w:r>
         <w:rPr>
-          <w:rFonts w:ascii="Times New Roman" w:hAnsi="Times New Roman" w:eastAsia="??"/>
+          <w:rFonts w:ascii="Times New Roman" w:hAnsi="Times New Roman" w:eastAsia="宋体"/>
+          <w:b w:val="0"/>
           <w:sz w:val="22"/>
         </w:rPr>
         <w:t>3. 射频模块负责 VHF 无线收发。</w:t>
       </w:r>
     </w:p>
     <w:p>
+      <w:pPr>
+        <w:spacing w:line="324" w:lineRule="auto" w:after="80"/>
+      </w:pPr>
       <w:r>
         <w:rPr>
-          <w:rFonts w:ascii="Times New Roman" w:hAnsi="Times New Roman" w:eastAsia="??"/>
+          <w:rFonts w:ascii="Times New Roman" w:hAnsi="Times New Roman" w:eastAsia="宋体"/>
+          <w:b w:val="0"/>
           <w:sz w:val="22"/>
         </w:rPr>
         <w:t>4. 天线完成远距离通信。</w:t>
       </w:r>
     </w:p>
     <w:p>
+      <w:pPr>
+        <w:spacing w:line="324" w:lineRule="auto" w:after="80"/>
+        <w:ind w:firstLine="440"/>
+      </w:pPr>
       <w:r>
         <w:rPr>
-          <w:rFonts w:ascii="Times New Roman" w:hAnsi="Times New Roman" w:eastAsia="??"/>
+          <w:rFonts w:ascii="Times New Roman" w:hAnsi="Times New Roman" w:eastAsia="宋体"/>
+          <w:b w:val="0"/>
           <w:sz w:val="22"/>
         </w:rPr>
         <w:t>注意：不要说 DSP 完成所有视频压缩。报告方案中视频压缩由外置 H.264 编码器承担，DSP 主要负责配置、调度和状态监测。</w:t>
       </w:r>
     </w:p>
     <w:p>
+      <w:pPr>
+        <w:spacing w:before="120"/>
+      </w:pPr>
       <w:r>
         <w:rPr>
-          <w:rFonts w:ascii="Times New Roman" w:hAnsi="Times New Roman" w:eastAsia="??"/>
+          <w:rFonts w:ascii="Times New Roman" w:hAnsi="Times New Roman" w:eastAsia="宋体"/>
           <w:b/>
-          <w:sz w:val="26"/>
+          <w:sz w:val="25"/>
         </w:rPr>
         <w:t>第4页：DSP选型</w:t>
       </w:r>
     </w:p>
     <w:p>
+      <w:pPr>
+        <w:spacing w:line="324" w:lineRule="auto" w:after="80"/>
+        <w:ind w:firstLine="440"/>
+      </w:pPr>
       <w:r>
         <w:rPr>
-          <w:rFonts w:ascii="Times New Roman" w:hAnsi="Times New Roman" w:eastAsia="??"/>
+          <w:rFonts w:ascii="Times New Roman" w:hAnsi="Times New Roman" w:eastAsia="宋体"/>
+          <w:b w:val="0"/>
           <w:sz w:val="22"/>
         </w:rPr>
         <w:t>建议做成表格。</w:t>
       </w:r>
     </w:p>
     <w:p>
+      <w:pPr>
+        <w:spacing w:line="324" w:lineRule="auto" w:after="80"/>
+        <w:ind w:firstLine="440"/>
+      </w:pPr>
       <w:r>
         <w:rPr>
-          <w:rFonts w:ascii="Times New Roman" w:hAnsi="Times New Roman" w:eastAsia="??"/>
+          <w:rFonts w:ascii="Times New Roman" w:hAnsi="Times New Roman" w:eastAsia="宋体"/>
+          <w:b w:val="0"/>
           <w:sz w:val="22"/>
         </w:rPr>
         <w:t>核心结论：选择 TI TMS320F28379D。</w:t>
       </w:r>
     </w:p>
     <w:p>
+      <w:pPr>
+        <w:spacing w:line="324" w:lineRule="auto" w:after="80"/>
+        <w:ind w:firstLine="440"/>
+      </w:pPr>
       <w:r>
         <w:rPr>
-          <w:rFonts w:ascii="Times New Roman" w:hAnsi="Times New Roman" w:eastAsia="??"/>
+          <w:rFonts w:ascii="Times New Roman" w:hAnsi="Times New Roman" w:eastAsia="宋体"/>
+          <w:b w:val="0"/>
           <w:sz w:val="22"/>
         </w:rPr>
         <w:t>原因：</w:t>
@@ -273,10 +386,12 @@
     <w:p>
       <w:pPr>
         <w:pStyle w:val="ListBullet"/>
+        <w:spacing w:line="324" w:lineRule="auto" w:after="80"/>
       </w:pPr>
       <w:r>
         <w:rPr>
-          <w:rFonts w:ascii="Times New Roman" w:hAnsi="Times New Roman" w:eastAsia="??"/>
+          <w:rFonts w:ascii="Times New Roman" w:hAnsi="Times New Roman" w:eastAsia="宋体"/>
+          <w:b w:val="0"/>
           <w:sz w:val="22"/>
         </w:rPr>
         <w:t>有 PWM，适合电机驱动控制。</w:t>
@@ -285,10 +400,12 @@
     <w:p>
       <w:pPr>
         <w:pStyle w:val="ListBullet"/>
+        <w:spacing w:line="324" w:lineRule="auto" w:after="80"/>
       </w:pPr>
       <w:r>
         <w:rPr>
-          <w:rFonts w:ascii="Times New Roman" w:hAnsi="Times New Roman" w:eastAsia="??"/>
+          <w:rFonts w:ascii="Times New Roman" w:hAnsi="Times New Roman" w:eastAsia="宋体"/>
+          <w:b w:val="0"/>
           <w:sz w:val="22"/>
         </w:rPr>
         <w:t>有 ADC，能采集电流和母线电压。</w:t>
@@ -297,10 +414,12 @@
     <w:p>
       <w:pPr>
         <w:pStyle w:val="ListBullet"/>
+        <w:spacing w:line="324" w:lineRule="auto" w:after="80"/>
       </w:pPr>
       <w:r>
         <w:rPr>
-          <w:rFonts w:ascii="Times New Roman" w:hAnsi="Times New Roman" w:eastAsia="??"/>
+          <w:rFonts w:ascii="Times New Roman" w:hAnsi="Times New Roman" w:eastAsia="宋体"/>
+          <w:b w:val="0"/>
           <w:sz w:val="22"/>
         </w:rPr>
         <w:t>有 QEP，能读取编码器速度。</w:t>
@@ -309,120 +428,174 @@
     <w:p>
       <w:pPr>
         <w:pStyle w:val="ListBullet"/>
+        <w:spacing w:line="324" w:lineRule="auto" w:after="80"/>
       </w:pPr>
       <w:r>
         <w:rPr>
-          <w:rFonts w:ascii="Times New Roman" w:hAnsi="Times New Roman" w:eastAsia="??"/>
+          <w:rFonts w:ascii="Times New Roman" w:hAnsi="Times New Roman" w:eastAsia="宋体"/>
+          <w:b w:val="0"/>
           <w:sz w:val="22"/>
         </w:rPr>
         <w:t>有 SPI/SCI/CAN，能连接视频模块和射频模块。</w:t>
       </w:r>
     </w:p>
     <w:p>
+      <w:pPr>
+        <w:spacing w:line="324" w:lineRule="auto" w:after="80"/>
+        <w:ind w:firstLine="440"/>
+      </w:pPr>
       <w:r>
         <w:rPr>
-          <w:rFonts w:ascii="Times New Roman" w:hAnsi="Times New Roman" w:eastAsia="??"/>
+          <w:rFonts w:ascii="Times New Roman" w:hAnsi="Times New Roman" w:eastAsia="宋体"/>
+          <w:b w:val="0"/>
           <w:sz w:val="22"/>
         </w:rPr>
         <w:t>讲述方式：不要只说“性能强”，要说它的外设正好对应任务需求。</w:t>
       </w:r>
     </w:p>
     <w:p>
+      <w:pPr>
+        <w:spacing w:before="120"/>
+      </w:pPr>
       <w:r>
         <w:rPr>
-          <w:rFonts w:ascii="Times New Roman" w:hAnsi="Times New Roman" w:eastAsia="??"/>
+          <w:rFonts w:ascii="Times New Roman" w:hAnsi="Times New Roman" w:eastAsia="宋体"/>
           <w:b/>
-          <w:sz w:val="26"/>
+          <w:sz w:val="25"/>
         </w:rPr>
         <w:t>第5页：驱动器控制模块</w:t>
       </w:r>
     </w:p>
     <w:p>
+      <w:pPr>
+        <w:spacing w:line="324" w:lineRule="auto" w:after="80"/>
+        <w:ind w:firstLine="440"/>
+      </w:pPr>
       <w:r>
         <w:rPr>
-          <w:rFonts w:ascii="Times New Roman" w:hAnsi="Times New Roman" w:eastAsia="??"/>
+          <w:rFonts w:ascii="Times New Roman" w:hAnsi="Times New Roman" w:eastAsia="宋体"/>
+          <w:b w:val="0"/>
           <w:sz w:val="22"/>
         </w:rPr>
         <w:t>建议放图：`motor_control_circuit.png`</w:t>
       </w:r>
     </w:p>
     <w:p>
+      <w:pPr>
+        <w:spacing w:line="324" w:lineRule="auto" w:after="80"/>
+        <w:ind w:firstLine="440"/>
+      </w:pPr>
       <w:r>
         <w:rPr>
-          <w:rFonts w:ascii="Times New Roman" w:hAnsi="Times New Roman" w:eastAsia="??"/>
+          <w:rFonts w:ascii="Times New Roman" w:hAnsi="Times New Roman" w:eastAsia="宋体"/>
+          <w:b w:val="0"/>
           <w:sz w:val="22"/>
         </w:rPr>
         <w:t>讲清楚信号流：</w:t>
       </w:r>
     </w:p>
     <w:p>
+      <w:pPr>
+        <w:spacing w:line="324" w:lineRule="auto" w:after="80"/>
+      </w:pPr>
       <w:r>
         <w:rPr>
-          <w:rFonts w:ascii="Times New Roman" w:hAnsi="Times New Roman" w:eastAsia="??"/>
+          <w:rFonts w:ascii="Times New Roman" w:hAnsi="Times New Roman" w:eastAsia="宋体"/>
+          <w:b w:val="0"/>
           <w:sz w:val="22"/>
         </w:rPr>
         <w:t>1. DSP 输出 PWM。</w:t>
       </w:r>
     </w:p>
     <w:p>
+      <w:pPr>
+        <w:spacing w:line="324" w:lineRule="auto" w:after="80"/>
+      </w:pPr>
       <w:r>
         <w:rPr>
-          <w:rFonts w:ascii="Times New Roman" w:hAnsi="Times New Roman" w:eastAsia="??"/>
+          <w:rFonts w:ascii="Times New Roman" w:hAnsi="Times New Roman" w:eastAsia="宋体"/>
+          <w:b w:val="0"/>
           <w:sz w:val="22"/>
         </w:rPr>
         <w:t>2. PWM 经过隔离驱动器。</w:t>
       </w:r>
     </w:p>
     <w:p>
+      <w:pPr>
+        <w:spacing w:line="324" w:lineRule="auto" w:after="80"/>
+      </w:pPr>
       <w:r>
         <w:rPr>
-          <w:rFonts w:ascii="Times New Roman" w:hAnsi="Times New Roman" w:eastAsia="??"/>
+          <w:rFonts w:ascii="Times New Roman" w:hAnsi="Times New Roman" w:eastAsia="宋体"/>
+          <w:b w:val="0"/>
           <w:sz w:val="22"/>
         </w:rPr>
         <w:t>3. 功率桥驱动电机。</w:t>
       </w:r>
     </w:p>
     <w:p>
+      <w:pPr>
+        <w:spacing w:line="324" w:lineRule="auto" w:after="80"/>
+      </w:pPr>
       <w:r>
         <w:rPr>
-          <w:rFonts w:ascii="Times New Roman" w:hAnsi="Times New Roman" w:eastAsia="??"/>
+          <w:rFonts w:ascii="Times New Roman" w:hAnsi="Times New Roman" w:eastAsia="宋体"/>
+          <w:b w:val="0"/>
           <w:sz w:val="22"/>
         </w:rPr>
         <w:t>4. 电流、电压、编码器反馈回 DSP。</w:t>
       </w:r>
     </w:p>
     <w:p>
+      <w:pPr>
+        <w:spacing w:line="324" w:lineRule="auto" w:after="80"/>
+        <w:ind w:firstLine="440"/>
+      </w:pPr>
       <w:r>
         <w:rPr>
-          <w:rFonts w:ascii="Times New Roman" w:hAnsi="Times New Roman" w:eastAsia="??"/>
+          <w:rFonts w:ascii="Times New Roman" w:hAnsi="Times New Roman" w:eastAsia="宋体"/>
+          <w:b w:val="0"/>
           <w:sz w:val="22"/>
         </w:rPr>
         <w:t>重点强调：电机控制不是开环调速，而是有反馈、有保护的闭环系统。</w:t>
       </w:r>
     </w:p>
     <w:p>
+      <w:pPr>
+        <w:spacing w:before="120"/>
+      </w:pPr>
       <w:r>
         <w:rPr>
-          <w:rFonts w:ascii="Times New Roman" w:hAnsi="Times New Roman" w:eastAsia="??"/>
+          <w:rFonts w:ascii="Times New Roman" w:hAnsi="Times New Roman" w:eastAsia="宋体"/>
           <w:b/>
-          <w:sz w:val="26"/>
+          <w:sz w:val="25"/>
         </w:rPr>
         <w:t>第6页：电机控制算法</w:t>
       </w:r>
     </w:p>
     <w:p>
+      <w:pPr>
+        <w:spacing w:line="324" w:lineRule="auto" w:after="80"/>
+        <w:ind w:firstLine="440"/>
+      </w:pPr>
       <w:r>
         <w:rPr>
-          <w:rFonts w:ascii="Times New Roman" w:hAnsi="Times New Roman" w:eastAsia="??"/>
+          <w:rFonts w:ascii="Times New Roman" w:hAnsi="Times New Roman" w:eastAsia="宋体"/>
+          <w:b w:val="0"/>
           <w:sz w:val="22"/>
         </w:rPr>
         <w:t>建议放图：`simulink_model_control_subsystem.png`</w:t>
       </w:r>
     </w:p>
     <w:p>
+      <w:pPr>
+        <w:spacing w:line="324" w:lineRule="auto" w:after="80"/>
+        <w:ind w:firstLine="440"/>
+      </w:pPr>
       <w:r>
         <w:rPr>
-          <w:rFonts w:ascii="Times New Roman" w:hAnsi="Times New Roman" w:eastAsia="??"/>
+          <w:rFonts w:ascii="Times New Roman" w:hAnsi="Times New Roman" w:eastAsia="宋体"/>
+          <w:b w:val="0"/>
           <w:sz w:val="22"/>
         </w:rPr>
         <w:t>讲述重点：</w:t>
@@ -431,10 +604,12 @@
     <w:p>
       <w:pPr>
         <w:pStyle w:val="ListBullet"/>
+        <w:spacing w:line="324" w:lineRule="auto" w:after="80"/>
       </w:pPr>
       <w:r>
         <w:rPr>
-          <w:rFonts w:ascii="Times New Roman" w:hAnsi="Times New Roman" w:eastAsia="??"/>
+          <w:rFonts w:ascii="Times New Roman" w:hAnsi="Times New Roman" w:eastAsia="宋体"/>
+          <w:b w:val="0"/>
           <w:sz w:val="22"/>
         </w:rPr>
         <w:t>控制器以目标转速和实际转速的误差为输入。</w:t>
@@ -443,10 +618,12 @@
     <w:p>
       <w:pPr>
         <w:pStyle w:val="ListBullet"/>
+        <w:spacing w:line="324" w:lineRule="auto" w:after="80"/>
       </w:pPr>
       <w:r>
         <w:rPr>
-          <w:rFonts w:ascii="Times New Roman" w:hAnsi="Times New Roman" w:eastAsia="??"/>
+          <w:rFonts w:ascii="Times New Roman" w:hAnsi="Times New Roman" w:eastAsia="宋体"/>
+          <w:b w:val="0"/>
           <w:sz w:val="22"/>
         </w:rPr>
         <w:t>PID 输出电压指令。</w:t>
@@ -455,10 +632,12 @@
     <w:p>
       <w:pPr>
         <w:pStyle w:val="ListBullet"/>
+        <w:spacing w:line="324" w:lineRule="auto" w:after="80"/>
       </w:pPr>
       <w:r>
         <w:rPr>
-          <w:rFonts w:ascii="Times New Roman" w:hAnsi="Times New Roman" w:eastAsia="??"/>
+          <w:rFonts w:ascii="Times New Roman" w:hAnsi="Times New Roman" w:eastAsia="宋体"/>
+          <w:b w:val="0"/>
           <w:sz w:val="22"/>
         </w:rPr>
         <w:t>电压指令经过母线限幅和电流保护。</w:t>
@@ -467,56 +646,81 @@
     <w:p>
       <w:pPr>
         <w:pStyle w:val="ListBullet"/>
+        <w:spacing w:line="324" w:lineRule="auto" w:after="80"/>
       </w:pPr>
       <w:r>
         <w:rPr>
-          <w:rFonts w:ascii="Times New Roman" w:hAnsi="Times New Roman" w:eastAsia="??"/>
+          <w:rFonts w:ascii="Times New Roman" w:hAnsi="Times New Roman" w:eastAsia="宋体"/>
+          <w:b w:val="0"/>
           <w:sz w:val="22"/>
         </w:rPr>
         <w:t>最终转成 PWM 占空比控制电机。</w:t>
       </w:r>
     </w:p>
     <w:p>
+      <w:pPr>
+        <w:spacing w:line="324" w:lineRule="auto" w:after="80"/>
+        <w:ind w:firstLine="440"/>
+      </w:pPr>
       <w:r>
         <w:rPr>
-          <w:rFonts w:ascii="Times New Roman" w:hAnsi="Times New Roman" w:eastAsia="??"/>
+          <w:rFonts w:ascii="Times New Roman" w:hAnsi="Times New Roman" w:eastAsia="宋体"/>
+          <w:b w:val="0"/>
           <w:sz w:val="22"/>
         </w:rPr>
         <w:t>初学者解释：PID 可以理解为“现在差多少、过去积累差多少、变化趋势有多快”三部分共同决定控制力度。</w:t>
       </w:r>
     </w:p>
     <w:p>
+      <w:pPr>
+        <w:spacing w:before="120"/>
+      </w:pPr>
       <w:r>
         <w:rPr>
-          <w:rFonts w:ascii="Times New Roman" w:hAnsi="Times New Roman" w:eastAsia="??"/>
+          <w:rFonts w:ascii="Times New Roman" w:hAnsi="Times New Roman" w:eastAsia="宋体"/>
           <w:b/>
-          <w:sz w:val="26"/>
+          <w:sz w:val="25"/>
         </w:rPr>
-        <w:t>第7页：专业化Simulink系统模型</w:t>
+        <w:t>第7页：R2025a专业化Simulink系统模型</w:t>
       </w:r>
     </w:p>
     <w:p>
+      <w:pPr>
+        <w:spacing w:line="324" w:lineRule="auto" w:after="80"/>
+        <w:ind w:firstLine="440"/>
+      </w:pPr>
       <w:r>
         <w:rPr>
-          <w:rFonts w:ascii="Times New Roman" w:hAnsi="Times New Roman" w:eastAsia="??"/>
+          <w:rFonts w:ascii="Times New Roman" w:hAnsi="Times New Roman" w:eastAsia="宋体"/>
+          <w:b w:val="0"/>
           <w:sz w:val="22"/>
         </w:rPr>
         <w:t>建议放图：`simulink_model_top.png`</w:t>
       </w:r>
     </w:p>
     <w:p>
+      <w:pPr>
+        <w:spacing w:line="324" w:lineRule="auto" w:after="80"/>
+        <w:ind w:firstLine="440"/>
+      </w:pPr>
       <w:r>
         <w:rPr>
-          <w:rFonts w:ascii="Times New Roman" w:hAnsi="Times New Roman" w:eastAsia="??"/>
+          <w:rFonts w:ascii="Times New Roman" w:hAnsi="Times New Roman" w:eastAsia="宋体"/>
+          <w:b w:val="0"/>
           <w:sz w:val="22"/>
         </w:rPr>
         <w:t>这一页要突出改进点。</w:t>
       </w:r>
     </w:p>
     <w:p>
+      <w:pPr>
+        <w:spacing w:line="324" w:lineRule="auto" w:after="80"/>
+        <w:ind w:firstLine="440"/>
+      </w:pPr>
       <w:r>
         <w:rPr>
-          <w:rFonts w:ascii="Times New Roman" w:hAnsi="Times New Roman" w:eastAsia="??"/>
+          <w:rFonts w:ascii="Times New Roman" w:hAnsi="Times New Roman" w:eastAsia="宋体"/>
+          <w:b w:val="0"/>
           <w:sz w:val="22"/>
         </w:rPr>
         <w:t>讲清楚：模型不是一个简单控制环，而是分成八个子系统：</w:t>
@@ -525,131 +729,262 @@
     <w:p>
       <w:pPr>
         <w:pStyle w:val="ListBullet"/>
+        <w:spacing w:line="324" w:lineRule="auto" w:after="80"/>
       </w:pPr>
       <w:r>
         <w:rPr>
-          <w:rFonts w:ascii="Times New Roman" w:hAnsi="Times New Roman" w:eastAsia="??"/>
+          <w:rFonts w:ascii="Times New Roman" w:hAnsi="Times New Roman" w:eastAsia="宋体"/>
+          <w:b w:val="0"/>
           <w:sz w:val="22"/>
         </w:rPr>
-        <w:t>Command Scheduler：命令调度</w:t>
+        <w:t>Command_Scheduler：命令调度</w:t>
       </w:r>
     </w:p>
     <w:p>
       <w:pPr>
         <w:pStyle w:val="ListBullet"/>
+        <w:spacing w:line="324" w:lineRule="auto" w:after="80"/>
       </w:pPr>
       <w:r>
         <w:rPr>
-          <w:rFonts w:ascii="Times New Roman" w:hAnsi="Times New Roman" w:eastAsia="??"/>
+          <w:rFonts w:ascii="Times New Roman" w:hAnsi="Times New Roman" w:eastAsia="宋体"/>
+          <w:b w:val="0"/>
           <w:sz w:val="22"/>
         </w:rPr>
-        <w:t>DSP Control Algorithm：DSP控制算法</w:t>
+        <w:t>DSP_Control_Algorithm：DSP控制算法</w:t>
       </w:r>
     </w:p>
     <w:p>
       <w:pPr>
         <w:pStyle w:val="ListBullet"/>
+        <w:spacing w:line="324" w:lineRule="auto" w:after="80"/>
       </w:pPr>
       <w:r>
         <w:rPr>
-          <w:rFonts w:ascii="Times New Roman" w:hAnsi="Times New Roman" w:eastAsia="??"/>
+          <w:rFonts w:ascii="Times New Roman" w:hAnsi="Times New Roman" w:eastAsia="宋体"/>
+          <w:b w:val="0"/>
           <w:sz w:val="22"/>
         </w:rPr>
-        <w:t>PWM and Isolated Gate Driver：PWM与隔离驱动</w:t>
+        <w:t>PWM_Gate_Driver_HBridge：PWM与隔离驱动</w:t>
       </w:r>
     </w:p>
     <w:p>
       <w:pPr>
         <w:pStyle w:val="ListBullet"/>
+        <w:spacing w:line="324" w:lineRule="auto" w:after="80"/>
       </w:pPr>
       <w:r>
         <w:rPr>
-          <w:rFonts w:ascii="Times New Roman" w:hAnsi="Times New Roman" w:eastAsia="??"/>
+          <w:rFonts w:ascii="Times New Roman" w:hAnsi="Times New Roman" w:eastAsia="宋体"/>
+          <w:b w:val="0"/>
           <w:sz w:val="22"/>
         </w:rPr>
-        <w:t>Power Stage and DC Motor：功率级与电机</w:t>
+        <w:t>DC_Motor_Electromechanical_Plant：功率级与电机</w:t>
       </w:r>
     </w:p>
     <w:p>
       <w:pPr>
         <w:pStyle w:val="ListBullet"/>
+        <w:spacing w:line="324" w:lineRule="auto" w:after="80"/>
       </w:pPr>
       <w:r>
         <w:rPr>
-          <w:rFonts w:ascii="Times New Roman" w:hAnsi="Times New Roman" w:eastAsia="??"/>
+          <w:rFonts w:ascii="Times New Roman" w:hAnsi="Times New Roman" w:eastAsia="宋体"/>
+          <w:b w:val="0"/>
           <w:sz w:val="22"/>
         </w:rPr>
-        <w:t>Sensor Acquisition：传感采集</w:t>
+        <w:t>ADC_QEP_Sensor_Acquisition：传感采集</w:t>
       </w:r>
     </w:p>
     <w:p>
       <w:pPr>
         <w:pStyle w:val="ListBullet"/>
+        <w:spacing w:line="324" w:lineRule="auto" w:after="80"/>
       </w:pPr>
       <w:r>
         <w:rPr>
-          <w:rFonts w:ascii="Times New Roman" w:hAnsi="Times New Roman" w:eastAsia="??"/>
+          <w:rFonts w:ascii="Times New Roman" w:hAnsi="Times New Roman" w:eastAsia="宋体"/>
+          <w:b w:val="0"/>
           <w:sz w:val="22"/>
         </w:rPr>
-        <w:t>Video Capture Pipeline：视频采集链路</w:t>
+        <w:t>Video_Capture_Codec_Buffer：视频采集链路</w:t>
       </w:r>
     </w:p>
     <w:p>
       <w:pPr>
         <w:pStyle w:val="ListBullet"/>
+        <w:spacing w:line="324" w:lineRule="auto" w:after="80"/>
       </w:pPr>
       <w:r>
         <w:rPr>
-          <w:rFonts w:ascii="Times New Roman" w:hAnsi="Times New Roman" w:eastAsia="??"/>
+          <w:rFonts w:ascii="Times New Roman" w:hAnsi="Times New Roman" w:eastAsia="宋体"/>
+          <w:b w:val="0"/>
           <w:sz w:val="22"/>
         </w:rPr>
-        <w:t>RF Link and Packet Channel：射频链路</w:t>
+        <w:t>VHF_RF_Transceiver_Channel：射频链路</w:t>
       </w:r>
     </w:p>
     <w:p>
       <w:pPr>
         <w:pStyle w:val="ListBullet"/>
+        <w:spacing w:line="324" w:lineRule="auto" w:after="80"/>
       </w:pPr>
       <w:r>
         <w:rPr>
-          <w:rFonts w:ascii="Times New Roman" w:hAnsi="Times New Roman" w:eastAsia="??"/>
+          <w:rFonts w:ascii="Times New Roman" w:hAnsi="Times New Roman" w:eastAsia="宋体"/>
+          <w:b w:val="0"/>
           <w:sz w:val="22"/>
         </w:rPr>
-        <w:t>Performance Monitors：性能监测</w:t>
+        <w:t>Supervisor_Performance_Monitors：性能监测</w:t>
       </w:r>
     </w:p>
     <w:p>
+      <w:pPr>
+        <w:spacing w:line="324" w:lineRule="auto" w:after="80"/>
+        <w:ind w:firstLine="440"/>
+      </w:pPr>
       <w:r>
         <w:rPr>
-          <w:rFonts w:ascii="Times New Roman" w:hAnsi="Times New Roman" w:eastAsia="??"/>
+          <w:rFonts w:ascii="Times New Roman" w:hAnsi="Times New Roman" w:eastAsia="宋体"/>
+          <w:b w:val="0"/>
           <w:sz w:val="22"/>
         </w:rPr>
-        <w:t>讲述重点：这样的分层结构更接近工程系统，也便于后续扩展硬件在环测试。</w:t>
+        <w:t>讲述重点：这样的分层结构更接近工程系统，也便于后续扩展硬件在环测试。报告生成时记录到模型有 83 个 block、74 条连线，并通过了 0.25 s 的 Simulink 烟雾仿真。</w:t>
       </w:r>
     </w:p>
     <w:p>
+      <w:pPr>
+        <w:spacing w:before="120"/>
+      </w:pPr>
       <w:r>
         <w:rPr>
-          <w:rFonts w:ascii="Times New Roman" w:hAnsi="Times New Roman" w:eastAsia="??"/>
+          <w:rFonts w:ascii="Times New Roman" w:hAnsi="Times New Roman" w:eastAsia="宋体"/>
           <w:b/>
-          <w:sz w:val="26"/>
+          <w:sz w:val="25"/>
         </w:rPr>
-        <w:t>第8页：视频捕获模块</w:t>
+        <w:t>第8页：Agentic Toolkit与模型审查</w:t>
       </w:r>
     </w:p>
     <w:p>
+      <w:pPr>
+        <w:spacing w:line="324" w:lineRule="auto" w:after="80"/>
+        <w:ind w:firstLine="440"/>
+      </w:pPr>
       <w:r>
         <w:rPr>
-          <w:rFonts w:ascii="Times New Roman" w:hAnsi="Times New Roman" w:eastAsia="??"/>
+          <w:rFonts w:ascii="Times New Roman" w:hAnsi="Times New Roman" w:eastAsia="宋体"/>
+          <w:b w:val="0"/>
+          <w:sz w:val="22"/>
+        </w:rPr>
+        <w:t>建议放图：`simulink_model_top.png`，旁边配一个小表格。</w:t>
+      </w:r>
+    </w:p>
+    <w:p>
+      <w:pPr>
+        <w:spacing w:line="324" w:lineRule="auto" w:after="80"/>
+        <w:ind w:firstLine="440"/>
+      </w:pPr>
+      <w:r>
+        <w:rPr>
+          <w:rFonts w:ascii="Times New Roman" w:hAnsi="Times New Roman" w:eastAsia="宋体"/>
+          <w:b w:val="0"/>
+          <w:sz w:val="22"/>
+        </w:rPr>
+        <w:t>讲清楚三点：</w:t>
+      </w:r>
+    </w:p>
+    <w:p>
+      <w:pPr>
+        <w:pStyle w:val="ListBullet"/>
+        <w:spacing w:line="324" w:lineRule="auto" w:after="80"/>
+      </w:pPr>
+      <w:r>
+        <w:rPr>
+          <w:rFonts w:ascii="Times New Roman" w:hAnsi="Times New Roman" w:eastAsia="宋体"/>
+          <w:b w:val="0"/>
+          <w:sz w:val="22"/>
+        </w:rPr>
+        <w:t>已使用 MATLAB 官方 Agentic Toolkit、Simulink Agentic Toolkit 和 MATLAB MCP Server 做 R2025a 初始化检查。</w:t>
+      </w:r>
+    </w:p>
+    <w:p>
+      <w:pPr>
+        <w:pStyle w:val="ListBullet"/>
+        <w:spacing w:line="324" w:lineRule="auto" w:after="80"/>
+      </w:pPr>
+      <w:r>
+        <w:rPr>
+          <w:rFonts w:ascii="Times New Roman" w:hAnsi="Times New Roman" w:eastAsia="宋体"/>
+          <w:b w:val="0"/>
+          <w:sz w:val="22"/>
+        </w:rPr>
+        <w:t>`output/logs/agentic_toolkit_status.json` 记录 SATK 初始化通过、MCP Server 存在、`shareMATLABSession` 可用。</w:t>
+      </w:r>
+    </w:p>
+    <w:p>
+      <w:pPr>
+        <w:pStyle w:val="ListBullet"/>
+        <w:spacing w:line="324" w:lineRule="auto" w:after="80"/>
+      </w:pPr>
+      <w:r>
+        <w:rPr>
+          <w:rFonts w:ascii="Times New Roman" w:hAnsi="Times New Roman" w:eastAsia="宋体"/>
+          <w:b w:val="0"/>
+          <w:sz w:val="22"/>
+        </w:rPr>
+        <w:t>这些工具强化的是建模流程、接口检查和可追溯记录，不代表已经做了硬件测试。</w:t>
+      </w:r>
+    </w:p>
+    <w:p>
+      <w:pPr>
+        <w:spacing w:line="324" w:lineRule="auto" w:after="80"/>
+        <w:ind w:firstLine="440"/>
+      </w:pPr>
+      <w:r>
+        <w:rPr>
+          <w:rFonts w:ascii="Times New Roman" w:hAnsi="Times New Roman" w:eastAsia="宋体"/>
+          <w:b w:val="0"/>
+          <w:sz w:val="22"/>
+        </w:rPr>
+        <w:t>一句话解释给初学者：Agentic Toolkit 可以理解为让 AI 助手按 MathWorks 的建模规范检查和组织 Simulink 工程，但仿真数据仍然必须由 MATLAB 脚本真实运行生成。</w:t>
+      </w:r>
+    </w:p>
+    <w:p>
+      <w:pPr>
+        <w:spacing w:before="120"/>
+      </w:pPr>
+      <w:r>
+        <w:rPr>
+          <w:rFonts w:ascii="Times New Roman" w:hAnsi="Times New Roman" w:eastAsia="宋体"/>
+          <w:b/>
+          <w:sz w:val="25"/>
+        </w:rPr>
+        <w:t>第9页：视频捕获模块</w:t>
+      </w:r>
+    </w:p>
+    <w:p>
+      <w:pPr>
+        <w:spacing w:line="324" w:lineRule="auto" w:after="80"/>
+        <w:ind w:firstLine="440"/>
+      </w:pPr>
+      <w:r>
+        <w:rPr>
+          <w:rFonts w:ascii="Times New Roman" w:hAnsi="Times New Roman" w:eastAsia="宋体"/>
+          <w:b w:val="0"/>
           <w:sz w:val="22"/>
         </w:rPr>
         <w:t>建议放图：`video_capture_circuit.png`</w:t>
       </w:r>
     </w:p>
     <w:p>
+      <w:pPr>
+        <w:spacing w:line="324" w:lineRule="auto" w:after="80"/>
+        <w:ind w:firstLine="440"/>
+      </w:pPr>
       <w:r>
         <w:rPr>
-          <w:rFonts w:ascii="Times New Roman" w:hAnsi="Times New Roman" w:eastAsia="??"/>
+          <w:rFonts w:ascii="Times New Roman" w:hAnsi="Times New Roman" w:eastAsia="宋体"/>
+          <w:b w:val="0"/>
           <w:sz w:val="22"/>
         </w:rPr>
         <w:t>讲清楚：</w:t>
@@ -658,10 +993,12 @@
     <w:p>
       <w:pPr>
         <w:pStyle w:val="ListBullet"/>
+        <w:spacing w:line="324" w:lineRule="auto" w:after="80"/>
       </w:pPr>
       <w:r>
         <w:rPr>
-          <w:rFonts w:ascii="Times New Roman" w:hAnsi="Times New Roman" w:eastAsia="??"/>
+          <w:rFonts w:ascii="Times New Roman" w:hAnsi="Times New Roman" w:eastAsia="宋体"/>
+          <w:b w:val="0"/>
           <w:sz w:val="22"/>
         </w:rPr>
         <w:t>摄像头输出视频。</w:t>
@@ -670,10 +1007,12 @@
     <w:p>
       <w:pPr>
         <w:pStyle w:val="ListBullet"/>
+        <w:spacing w:line="324" w:lineRule="auto" w:after="80"/>
       </w:pPr>
       <w:r>
         <w:rPr>
-          <w:rFonts w:ascii="Times New Roman" w:hAnsi="Times New Roman" w:eastAsia="??"/>
+          <w:rFonts w:ascii="Times New Roman" w:hAnsi="Times New Roman" w:eastAsia="宋体"/>
+          <w:b w:val="0"/>
           <w:sz w:val="22"/>
         </w:rPr>
         <w:t>帧缓存解决速率和时钟差异。</w:t>
@@ -682,10 +1021,12 @@
     <w:p>
       <w:pPr>
         <w:pStyle w:val="ListBullet"/>
+        <w:spacing w:line="324" w:lineRule="auto" w:after="80"/>
       </w:pPr>
       <w:r>
         <w:rPr>
-          <w:rFonts w:ascii="Times New Roman" w:hAnsi="Times New Roman" w:eastAsia="??"/>
+          <w:rFonts w:ascii="Times New Roman" w:hAnsi="Times New Roman" w:eastAsia="宋体"/>
+          <w:b w:val="0"/>
           <w:sz w:val="22"/>
         </w:rPr>
         <w:t>H.264 编码器降低带宽。</w:t>
@@ -694,47 +1035,67 @@
     <w:p>
       <w:pPr>
         <w:pStyle w:val="ListBullet"/>
+        <w:spacing w:line="324" w:lineRule="auto" w:after="80"/>
       </w:pPr>
       <w:r>
         <w:rPr>
-          <w:rFonts w:ascii="Times New Roman" w:hAnsi="Times New Roman" w:eastAsia="??"/>
+          <w:rFonts w:ascii="Times New Roman" w:hAnsi="Times New Roman" w:eastAsia="宋体"/>
+          <w:b w:val="0"/>
           <w:sz w:val="22"/>
         </w:rPr>
         <w:t>DSP 监控缓存状态和码率，不直接承担全部压缩计算。</w:t>
       </w:r>
     </w:p>
     <w:p>
+      <w:pPr>
+        <w:spacing w:line="324" w:lineRule="auto" w:after="80"/>
+        <w:ind w:firstLine="440"/>
+      </w:pPr>
       <w:r>
         <w:rPr>
-          <w:rFonts w:ascii="Times New Roman" w:hAnsi="Times New Roman" w:eastAsia="??"/>
+          <w:rFonts w:ascii="Times New Roman" w:hAnsi="Times New Roman" w:eastAsia="宋体"/>
+          <w:b w:val="0"/>
           <w:sz w:val="22"/>
         </w:rPr>
         <w:t>不要讲成“DSP实时压缩高清视频”，这不符合报告方案。</w:t>
       </w:r>
     </w:p>
     <w:p>
+      <w:pPr>
+        <w:spacing w:before="120"/>
+      </w:pPr>
       <w:r>
         <w:rPr>
-          <w:rFonts w:ascii="Times New Roman" w:hAnsi="Times New Roman" w:eastAsia="??"/>
+          <w:rFonts w:ascii="Times New Roman" w:hAnsi="Times New Roman" w:eastAsia="宋体"/>
           <w:b/>
-          <w:sz w:val="26"/>
+          <w:sz w:val="25"/>
         </w:rPr>
-        <w:t>第9页：射频集成模块</w:t>
+        <w:t>第10页：射频集成模块</w:t>
       </w:r>
     </w:p>
     <w:p>
+      <w:pPr>
+        <w:spacing w:line="324" w:lineRule="auto" w:after="80"/>
+        <w:ind w:firstLine="440"/>
+      </w:pPr>
       <w:r>
         <w:rPr>
-          <w:rFonts w:ascii="Times New Roman" w:hAnsi="Times New Roman" w:eastAsia="??"/>
+          <w:rFonts w:ascii="Times New Roman" w:hAnsi="Times New Roman" w:eastAsia="宋体"/>
+          <w:b w:val="0"/>
           <w:sz w:val="22"/>
         </w:rPr>
         <w:t>建议放图：`rf_integrated_circuit.png`</w:t>
       </w:r>
     </w:p>
     <w:p>
+      <w:pPr>
+        <w:spacing w:line="324" w:lineRule="auto" w:after="80"/>
+        <w:ind w:firstLine="440"/>
+      </w:pPr>
       <w:r>
         <w:rPr>
-          <w:rFonts w:ascii="Times New Roman" w:hAnsi="Times New Roman" w:eastAsia="??"/>
+          <w:rFonts w:ascii="Times New Roman" w:hAnsi="Times New Roman" w:eastAsia="宋体"/>
+          <w:b w:val="0"/>
           <w:sz w:val="22"/>
         </w:rPr>
         <w:t>讲清楚模块组成：</w:t>
@@ -743,10 +1104,12 @@
     <w:p>
       <w:pPr>
         <w:pStyle w:val="ListBullet"/>
+        <w:spacing w:line="324" w:lineRule="auto" w:after="80"/>
       </w:pPr>
       <w:r>
         <w:rPr>
-          <w:rFonts w:ascii="Times New Roman" w:hAnsi="Times New Roman" w:eastAsia="??"/>
+          <w:rFonts w:ascii="Times New Roman" w:hAnsi="Times New Roman" w:eastAsia="宋体"/>
+          <w:b w:val="0"/>
           <w:sz w:val="22"/>
         </w:rPr>
         <w:t>DAC/ADC</w:t>
@@ -755,10 +1118,12 @@
     <w:p>
       <w:pPr>
         <w:pStyle w:val="ListBullet"/>
+        <w:spacing w:line="324" w:lineRule="auto" w:after="80"/>
       </w:pPr>
       <w:r>
         <w:rPr>
-          <w:rFonts w:ascii="Times New Roman" w:hAnsi="Times New Roman" w:eastAsia="??"/>
+          <w:rFonts w:ascii="Times New Roman" w:hAnsi="Times New Roman" w:eastAsia="宋体"/>
+          <w:b w:val="0"/>
           <w:sz w:val="22"/>
         </w:rPr>
         <w:t>调制解调</w:t>
@@ -767,10 +1132,12 @@
     <w:p>
       <w:pPr>
         <w:pStyle w:val="ListBullet"/>
+        <w:spacing w:line="324" w:lineRule="auto" w:after="80"/>
       </w:pPr>
       <w:r>
         <w:rPr>
-          <w:rFonts w:ascii="Times New Roman" w:hAnsi="Times New Roman" w:eastAsia="??"/>
+          <w:rFonts w:ascii="Times New Roman" w:hAnsi="Times New Roman" w:eastAsia="宋体"/>
+          <w:b w:val="0"/>
           <w:sz w:val="22"/>
         </w:rPr>
         <w:t>频率合成</w:t>
@@ -779,10 +1146,12 @@
     <w:p>
       <w:pPr>
         <w:pStyle w:val="ListBullet"/>
+        <w:spacing w:line="324" w:lineRule="auto" w:after="80"/>
       </w:pPr>
       <w:r>
         <w:rPr>
-          <w:rFonts w:ascii="Times New Roman" w:hAnsi="Times New Roman" w:eastAsia="??"/>
+          <w:rFonts w:ascii="Times New Roman" w:hAnsi="Times New Roman" w:eastAsia="宋体"/>
+          <w:b w:val="0"/>
           <w:sz w:val="22"/>
         </w:rPr>
         <w:t>滤波器组</w:t>
@@ -791,10 +1160,12 @@
     <w:p>
       <w:pPr>
         <w:pStyle w:val="ListBullet"/>
+        <w:spacing w:line="324" w:lineRule="auto" w:after="80"/>
       </w:pPr>
       <w:r>
         <w:rPr>
-          <w:rFonts w:ascii="Times New Roman" w:hAnsi="Times New Roman" w:eastAsia="??"/>
+          <w:rFonts w:ascii="Times New Roman" w:hAnsi="Times New Roman" w:eastAsia="宋体"/>
+          <w:b w:val="0"/>
           <w:sz w:val="22"/>
         </w:rPr>
         <w:t>LNA/PA</w:t>
@@ -803,138 +1174,200 @@
     <w:p>
       <w:pPr>
         <w:pStyle w:val="ListBullet"/>
+        <w:spacing w:line="324" w:lineRule="auto" w:after="80"/>
       </w:pPr>
       <w:r>
         <w:rPr>
-          <w:rFonts w:ascii="Times New Roman" w:hAnsi="Times New Roman" w:eastAsia="??"/>
+          <w:rFonts w:ascii="Times New Roman" w:hAnsi="Times New Roman" w:eastAsia="宋体"/>
+          <w:b w:val="0"/>
           <w:sz w:val="22"/>
         </w:rPr>
         <w:t>天线匹配</w:t>
       </w:r>
     </w:p>
     <w:p>
+      <w:pPr>
+        <w:spacing w:line="324" w:lineRule="auto" w:after="80"/>
+        <w:ind w:firstLine="440"/>
+      </w:pPr>
       <w:r>
         <w:rPr>
-          <w:rFonts w:ascii="Times New Roman" w:hAnsi="Times New Roman" w:eastAsia="??"/>
+          <w:rFonts w:ascii="Times New Roman" w:hAnsi="Times New Roman" w:eastAsia="宋体"/>
+          <w:b w:val="0"/>
           <w:sz w:val="22"/>
         </w:rPr>
         <w:t>重点：控制信号和视频数据占用不同频带。控制链路优先保证可靠性，视频链路优先保证吞吐量。</w:t>
       </w:r>
     </w:p>
     <w:p>
+      <w:pPr>
+        <w:spacing w:before="120"/>
+      </w:pPr>
       <w:r>
         <w:rPr>
-          <w:rFonts w:ascii="Times New Roman" w:hAnsi="Times New Roman" w:eastAsia="??"/>
+          <w:rFonts w:ascii="Times New Roman" w:hAnsi="Times New Roman" w:eastAsia="宋体"/>
           <w:b/>
-          <w:sz w:val="26"/>
+          <w:sz w:val="25"/>
         </w:rPr>
-        <w:t>第10页：MATLAB/Simulink仿真流程</w:t>
+        <w:t>第11页：MATLAB/Simulink仿真流程</w:t>
       </w:r>
     </w:p>
     <w:p>
+      <w:pPr>
+        <w:spacing w:line="324" w:lineRule="auto" w:after="80"/>
+        <w:ind w:firstLine="440"/>
+      </w:pPr>
       <w:r>
         <w:rPr>
-          <w:rFonts w:ascii="Times New Roman" w:hAnsi="Times New Roman" w:eastAsia="??"/>
+          <w:rFonts w:ascii="Times New Roman" w:hAnsi="Times New Roman" w:eastAsia="宋体"/>
+          <w:b w:val="0"/>
           <w:sz w:val="22"/>
         </w:rPr>
         <w:t>建议放图：`software_flow.png`</w:t>
       </w:r>
     </w:p>
     <w:p>
+      <w:pPr>
+        <w:spacing w:line="324" w:lineRule="auto" w:after="80"/>
+        <w:ind w:firstLine="440"/>
+      </w:pPr>
       <w:r>
         <w:rPr>
-          <w:rFonts w:ascii="Times New Roman" w:hAnsi="Times New Roman" w:eastAsia="??"/>
+          <w:rFonts w:ascii="Times New Roman" w:hAnsi="Times New Roman" w:eastAsia="宋体"/>
+          <w:b w:val="0"/>
           <w:sz w:val="22"/>
         </w:rPr>
         <w:t>讲述流程：</w:t>
       </w:r>
     </w:p>
     <w:p>
+      <w:pPr>
+        <w:spacing w:line="324" w:lineRule="auto" w:after="80"/>
+      </w:pPr>
       <w:r>
         <w:rPr>
-          <w:rFonts w:ascii="Times New Roman" w:hAnsi="Times New Roman" w:eastAsia="??"/>
+          <w:rFonts w:ascii="Times New Roman" w:hAnsi="Times New Roman" w:eastAsia="宋体"/>
+          <w:b w:val="0"/>
           <w:sz w:val="22"/>
         </w:rPr>
         <w:t>1. 加载参数。</w:t>
       </w:r>
     </w:p>
     <w:p>
+      <w:pPr>
+        <w:spacing w:line="324" w:lineRule="auto" w:after="80"/>
+      </w:pPr>
       <w:r>
         <w:rPr>
-          <w:rFonts w:ascii="Times New Roman" w:hAnsi="Times New Roman" w:eastAsia="??"/>
+          <w:rFonts w:ascii="Times New Roman" w:hAnsi="Times New Roman" w:eastAsia="宋体"/>
+          <w:b w:val="0"/>
           <w:sz w:val="22"/>
         </w:rPr>
         <w:t>2. 运行电机控制仿真。</w:t>
       </w:r>
     </w:p>
     <w:p>
+      <w:pPr>
+        <w:spacing w:line="324" w:lineRule="auto" w:after="80"/>
+      </w:pPr>
       <w:r>
         <w:rPr>
-          <w:rFonts w:ascii="Times New Roman" w:hAnsi="Times New Roman" w:eastAsia="??"/>
+          <w:rFonts w:ascii="Times New Roman" w:hAnsi="Times New Roman" w:eastAsia="宋体"/>
+          <w:b w:val="0"/>
           <w:sz w:val="22"/>
         </w:rPr>
         <w:t>3. 运行视频链路仿真。</w:t>
       </w:r>
     </w:p>
     <w:p>
+      <w:pPr>
+        <w:spacing w:line="324" w:lineRule="auto" w:after="80"/>
+      </w:pPr>
       <w:r>
         <w:rPr>
-          <w:rFonts w:ascii="Times New Roman" w:hAnsi="Times New Roman" w:eastAsia="??"/>
+          <w:rFonts w:ascii="Times New Roman" w:hAnsi="Times New Roman" w:eastAsia="宋体"/>
+          <w:b w:val="0"/>
           <w:sz w:val="22"/>
         </w:rPr>
         <w:t>4. 运行射频链路仿真。</w:t>
       </w:r>
     </w:p>
     <w:p>
+      <w:pPr>
+        <w:spacing w:line="324" w:lineRule="auto" w:after="80"/>
+      </w:pPr>
       <w:r>
         <w:rPr>
-          <w:rFonts w:ascii="Times New Roman" w:hAnsi="Times New Roman" w:eastAsia="??"/>
+          <w:rFonts w:ascii="Times New Roman" w:hAnsi="Times New Roman" w:eastAsia="宋体"/>
+          <w:b w:val="0"/>
           <w:sz w:val="22"/>
         </w:rPr>
         <w:t>5. 校验结果。</w:t>
       </w:r>
     </w:p>
     <w:p>
+      <w:pPr>
+        <w:spacing w:line="324" w:lineRule="auto" w:after="80"/>
+      </w:pPr>
       <w:r>
         <w:rPr>
-          <w:rFonts w:ascii="Times New Roman" w:hAnsi="Times New Roman" w:eastAsia="??"/>
+          <w:rFonts w:ascii="Times New Roman" w:hAnsi="Times New Roman" w:eastAsia="宋体"/>
+          <w:b w:val="0"/>
           <w:sz w:val="22"/>
         </w:rPr>
         <w:t>6. 自动生成报告。</w:t>
       </w:r>
     </w:p>
     <w:p>
+      <w:pPr>
+        <w:spacing w:line="324" w:lineRule="auto" w:after="80"/>
+        <w:ind w:firstLine="440"/>
+      </w:pPr>
       <w:r>
         <w:rPr>
-          <w:rFonts w:ascii="Times New Roman" w:hAnsi="Times New Roman" w:eastAsia="??"/>
+          <w:rFonts w:ascii="Times New Roman" w:hAnsi="Times New Roman" w:eastAsia="宋体"/>
+          <w:b w:val="0"/>
           <w:sz w:val="22"/>
         </w:rPr>
         <w:t>强调：箭头表示数据和流程方向，所有结果来自脚本运行，不是手写数据。</w:t>
       </w:r>
     </w:p>
     <w:p>
+      <w:pPr>
+        <w:spacing w:before="120"/>
+      </w:pPr>
       <w:r>
         <w:rPr>
-          <w:rFonts w:ascii="Times New Roman" w:hAnsi="Times New Roman" w:eastAsia="??"/>
+          <w:rFonts w:ascii="Times New Roman" w:hAnsi="Times New Roman" w:eastAsia="宋体"/>
           <w:b/>
-          <w:sz w:val="26"/>
+          <w:sz w:val="25"/>
         </w:rPr>
-        <w:t>第11页：系统性能总览</w:t>
+        <w:t>第12页：系统性能总览</w:t>
       </w:r>
     </w:p>
     <w:p>
+      <w:pPr>
+        <w:spacing w:line="324" w:lineRule="auto" w:after="80"/>
+        <w:ind w:firstLine="440"/>
+      </w:pPr>
       <w:r>
         <w:rPr>
-          <w:rFonts w:ascii="Times New Roman" w:hAnsi="Times New Roman" w:eastAsia="??"/>
+          <w:rFonts w:ascii="Times New Roman" w:hAnsi="Times New Roman" w:eastAsia="宋体"/>
+          <w:b w:val="0"/>
           <w:sz w:val="22"/>
         </w:rPr>
         <w:t>建议放图：`system_performance_summary.png`</w:t>
       </w:r>
     </w:p>
     <w:p>
+      <w:pPr>
+        <w:spacing w:line="324" w:lineRule="auto" w:after="80"/>
+        <w:ind w:firstLine="440"/>
+      </w:pPr>
       <w:r>
         <w:rPr>
-          <w:rFonts w:ascii="Times New Roman" w:hAnsi="Times New Roman" w:eastAsia="??"/>
+          <w:rFonts w:ascii="Times New Roman" w:hAnsi="Times New Roman" w:eastAsia="宋体"/>
+          <w:b w:val="0"/>
           <w:sz w:val="22"/>
         </w:rPr>
         <w:t>讲述重点：</w:t>
@@ -943,10 +1376,12 @@
     <w:p>
       <w:pPr>
         <w:pStyle w:val="ListBullet"/>
+        <w:spacing w:line="324" w:lineRule="auto" w:after="80"/>
       </w:pPr>
       <w:r>
         <w:rPr>
-          <w:rFonts w:ascii="Times New Roman" w:hAnsi="Times New Roman" w:eastAsia="??"/>
+          <w:rFonts w:ascii="Times New Roman" w:hAnsi="Times New Roman" w:eastAsia="宋体"/>
+          <w:b w:val="0"/>
           <w:sz w:val="22"/>
         </w:rPr>
         <w:t>电机响应时间、超调量反映控制性能。</w:t>
@@ -955,10 +1390,12 @@
     <w:p>
       <w:pPr>
         <w:pStyle w:val="ListBullet"/>
+        <w:spacing w:line="324" w:lineRule="auto" w:after="80"/>
       </w:pPr>
       <w:r>
         <w:rPr>
-          <w:rFonts w:ascii="Times New Roman" w:hAnsi="Times New Roman" w:eastAsia="??"/>
+          <w:rFonts w:ascii="Times New Roman" w:hAnsi="Times New Roman" w:eastAsia="宋体"/>
+          <w:b w:val="0"/>
           <w:sz w:val="22"/>
         </w:rPr>
         <w:t>视频载荷和缓存反映传输压力。</w:t>
@@ -967,47 +1404,67 @@
     <w:p>
       <w:pPr>
         <w:pStyle w:val="ListBullet"/>
+        <w:spacing w:line="324" w:lineRule="auto" w:after="80"/>
       </w:pPr>
       <w:r>
         <w:rPr>
-          <w:rFonts w:ascii="Times New Roman" w:hAnsi="Times New Roman" w:eastAsia="??"/>
+          <w:rFonts w:ascii="Times New Roman" w:hAnsi="Times New Roman" w:eastAsia="宋体"/>
+          <w:b w:val="0"/>
           <w:sz w:val="22"/>
         </w:rPr>
         <w:t>SNR 反映射频链路裕量。</w:t>
       </w:r>
     </w:p>
     <w:p>
+      <w:pPr>
+        <w:spacing w:line="324" w:lineRule="auto" w:after="80"/>
+        <w:ind w:firstLine="440"/>
+      </w:pPr>
       <w:r>
         <w:rPr>
-          <w:rFonts w:ascii="Times New Roman" w:hAnsi="Times New Roman" w:eastAsia="??"/>
+          <w:rFonts w:ascii="Times New Roman" w:hAnsi="Times New Roman" w:eastAsia="宋体"/>
+          <w:b w:val="0"/>
           <w:sz w:val="22"/>
         </w:rPr>
         <w:t>这一页是全局结果，不要展开太多公式。先让听众知道系统整体表现。</w:t>
       </w:r>
     </w:p>
     <w:p>
+      <w:pPr>
+        <w:spacing w:before="120"/>
+      </w:pPr>
       <w:r>
         <w:rPr>
-          <w:rFonts w:ascii="Times New Roman" w:hAnsi="Times New Roman" w:eastAsia="??"/>
+          <w:rFonts w:ascii="Times New Roman" w:hAnsi="Times New Roman" w:eastAsia="宋体"/>
           <w:b/>
-          <w:sz w:val="26"/>
+          <w:sz w:val="25"/>
         </w:rPr>
-        <w:t>第12页：电机仿真结果</w:t>
+        <w:t>第13页：电机仿真结果</w:t>
       </w:r>
     </w:p>
     <w:p>
+      <w:pPr>
+        <w:spacing w:line="324" w:lineRule="auto" w:after="80"/>
+        <w:ind w:firstLine="440"/>
+      </w:pPr>
       <w:r>
         <w:rPr>
-          <w:rFonts w:ascii="Times New Roman" w:hAnsi="Times New Roman" w:eastAsia="??"/>
+          <w:rFonts w:ascii="Times New Roman" w:hAnsi="Times New Roman" w:eastAsia="宋体"/>
+          <w:b w:val="0"/>
           <w:sz w:val="22"/>
         </w:rPr>
         <w:t>建议放图：`motor_response.png`</w:t>
       </w:r>
     </w:p>
     <w:p>
+      <w:pPr>
+        <w:spacing w:line="324" w:lineRule="auto" w:after="80"/>
+        <w:ind w:firstLine="440"/>
+      </w:pPr>
       <w:r>
         <w:rPr>
-          <w:rFonts w:ascii="Times New Roman" w:hAnsi="Times New Roman" w:eastAsia="??"/>
+          <w:rFonts w:ascii="Times New Roman" w:hAnsi="Times New Roman" w:eastAsia="宋体"/>
+          <w:b w:val="0"/>
           <w:sz w:val="22"/>
         </w:rPr>
         <w:t>重点数据：</w:t>
@@ -1016,10 +1473,12 @@
     <w:p>
       <w:pPr>
         <w:pStyle w:val="ListBullet"/>
+        <w:spacing w:line="324" w:lineRule="auto" w:after="80"/>
       </w:pPr>
       <w:r>
         <w:rPr>
-          <w:rFonts w:ascii="Times New Roman" w:hAnsi="Times New Roman" w:eastAsia="??"/>
+          <w:rFonts w:ascii="Times New Roman" w:hAnsi="Times New Roman" w:eastAsia="宋体"/>
+          <w:b w:val="0"/>
           <w:sz w:val="22"/>
         </w:rPr>
         <w:t>90% 上升时间：0.173 s</w:t>
@@ -1028,10 +1487,12 @@
     <w:p>
       <w:pPr>
         <w:pStyle w:val="ListBullet"/>
+        <w:spacing w:line="324" w:lineRule="auto" w:after="80"/>
       </w:pPr>
       <w:r>
         <w:rPr>
-          <w:rFonts w:ascii="Times New Roman" w:hAnsi="Times New Roman" w:eastAsia="??"/>
+          <w:rFonts w:ascii="Times New Roman" w:hAnsi="Times New Roman" w:eastAsia="宋体"/>
+          <w:b w:val="0"/>
           <w:sz w:val="22"/>
         </w:rPr>
         <w:t>超调：9.55%</w:t>
@@ -1040,10 +1501,12 @@
     <w:p>
       <w:pPr>
         <w:pStyle w:val="ListBullet"/>
+        <w:spacing w:line="324" w:lineRule="auto" w:after="80"/>
       </w:pPr>
       <w:r>
         <w:rPr>
-          <w:rFonts w:ascii="Times New Roman" w:hAnsi="Times New Roman" w:eastAsia="??"/>
+          <w:rFonts w:ascii="Times New Roman" w:hAnsi="Times New Roman" w:eastAsia="宋体"/>
+          <w:b w:val="0"/>
           <w:sz w:val="22"/>
         </w:rPr>
         <w:t>正向稳态误差：0.95 rpm</w:t>
@@ -1052,47 +1515,67 @@
     <w:p>
       <w:pPr>
         <w:pStyle w:val="ListBullet"/>
+        <w:spacing w:line="324" w:lineRule="auto" w:after="80"/>
       </w:pPr>
       <w:r>
         <w:rPr>
-          <w:rFonts w:ascii="Times New Roman" w:hAnsi="Times New Roman" w:eastAsia="??"/>
+          <w:rFonts w:ascii="Times New Roman" w:hAnsi="Times New Roman" w:eastAsia="宋体"/>
+          <w:b w:val="0"/>
           <w:sz w:val="22"/>
         </w:rPr>
         <w:t>最终速度：约 -600 rpm</w:t>
       </w:r>
     </w:p>
     <w:p>
+      <w:pPr>
+        <w:spacing w:line="324" w:lineRule="auto" w:after="80"/>
+        <w:ind w:firstLine="440"/>
+      </w:pPr>
       <w:r>
         <w:rPr>
-          <w:rFonts w:ascii="Times New Roman" w:hAnsi="Times New Roman" w:eastAsia="??"/>
+          <w:rFonts w:ascii="Times New Roman" w:hAnsi="Times New Roman" w:eastAsia="宋体"/>
+          <w:b w:val="0"/>
           <w:sz w:val="22"/>
         </w:rPr>
         <w:t>讲述逻辑：电机能快速跟踪目标转速，能完成方向反转，电流和 PWM 占空比变化可观察。</w:t>
       </w:r>
     </w:p>
     <w:p>
+      <w:pPr>
+        <w:spacing w:before="120"/>
+      </w:pPr>
       <w:r>
         <w:rPr>
-          <w:rFonts w:ascii="Times New Roman" w:hAnsi="Times New Roman" w:eastAsia="??"/>
+          <w:rFonts w:ascii="Times New Roman" w:hAnsi="Times New Roman" w:eastAsia="宋体"/>
           <w:b/>
-          <w:sz w:val="26"/>
+          <w:sz w:val="25"/>
         </w:rPr>
-        <w:t>第13页：视频链路仿真结果</w:t>
+        <w:t>第14页：视频链路仿真结果</w:t>
       </w:r>
     </w:p>
     <w:p>
+      <w:pPr>
+        <w:spacing w:line="324" w:lineRule="auto" w:after="80"/>
+        <w:ind w:firstLine="440"/>
+      </w:pPr>
       <w:r>
         <w:rPr>
-          <w:rFonts w:ascii="Times New Roman" w:hAnsi="Times New Roman" w:eastAsia="??"/>
+          <w:rFonts w:ascii="Times New Roman" w:hAnsi="Times New Roman" w:eastAsia="宋体"/>
+          <w:b w:val="0"/>
           <w:sz w:val="22"/>
         </w:rPr>
         <w:t>建议放图：`video_buffer.png`</w:t>
       </w:r>
     </w:p>
     <w:p>
+      <w:pPr>
+        <w:spacing w:line="324" w:lineRule="auto" w:after="80"/>
+        <w:ind w:firstLine="440"/>
+      </w:pPr>
       <w:r>
         <w:rPr>
-          <w:rFonts w:ascii="Times New Roman" w:hAnsi="Times New Roman" w:eastAsia="??"/>
+          <w:rFonts w:ascii="Times New Roman" w:hAnsi="Times New Roman" w:eastAsia="宋体"/>
+          <w:b w:val="0"/>
           <w:sz w:val="22"/>
         </w:rPr>
         <w:t>重点数据：</w:t>
@@ -1101,10 +1584,12 @@
     <w:p>
       <w:pPr>
         <w:pStyle w:val="ListBullet"/>
+        <w:spacing w:line="324" w:lineRule="auto" w:after="80"/>
       </w:pPr>
       <w:r>
         <w:rPr>
-          <w:rFonts w:ascii="Times New Roman" w:hAnsi="Times New Roman" w:eastAsia="??"/>
+          <w:rFonts w:ascii="Times New Roman" w:hAnsi="Times New Roman" w:eastAsia="宋体"/>
+          <w:b w:val="0"/>
           <w:sz w:val="22"/>
         </w:rPr>
         <w:t>平均视频载荷：36.24 Mbps</w:t>
@@ -1113,10 +1598,12 @@
     <w:p>
       <w:pPr>
         <w:pStyle w:val="ListBullet"/>
+        <w:spacing w:line="324" w:lineRule="auto" w:after="80"/>
       </w:pPr>
       <w:r>
         <w:rPr>
-          <w:rFonts w:ascii="Times New Roman" w:hAnsi="Times New Roman" w:eastAsia="??"/>
+          <w:rFonts w:ascii="Times New Roman" w:hAnsi="Times New Roman" w:eastAsia="宋体"/>
+          <w:b w:val="0"/>
           <w:sz w:val="22"/>
         </w:rPr>
         <w:t>折算约 4.53 MB/s</w:t>
@@ -1125,10 +1612,12 @@
     <w:p>
       <w:pPr>
         <w:pStyle w:val="ListBullet"/>
+        <w:spacing w:line="324" w:lineRule="auto" w:after="80"/>
       </w:pPr>
       <w:r>
         <w:rPr>
-          <w:rFonts w:ascii="Times New Roman" w:hAnsi="Times New Roman" w:eastAsia="??"/>
+          <w:rFonts w:ascii="Times New Roman" w:hAnsi="Times New Roman" w:eastAsia="宋体"/>
+          <w:b w:val="0"/>
           <w:sz w:val="22"/>
         </w:rPr>
         <w:t>丢帧数：0</w:t>
@@ -1137,47 +1626,67 @@
     <w:p>
       <w:pPr>
         <w:pStyle w:val="ListBullet"/>
+        <w:spacing w:line="324" w:lineRule="auto" w:after="80"/>
       </w:pPr>
       <w:r>
         <w:rPr>
-          <w:rFonts w:ascii="Times New Roman" w:hAnsi="Times New Roman" w:eastAsia="??"/>
+          <w:rFonts w:ascii="Times New Roman" w:hAnsi="Times New Roman" w:eastAsia="宋体"/>
+          <w:b w:val="0"/>
           <w:sz w:val="22"/>
         </w:rPr>
         <w:t>最大缓存占用：4.89 MB</w:t>
       </w:r>
     </w:p>
     <w:p>
+      <w:pPr>
+        <w:spacing w:line="324" w:lineRule="auto" w:after="80"/>
+        <w:ind w:firstLine="440"/>
+      </w:pPr>
       <w:r>
         <w:rPr>
-          <w:rFonts w:ascii="Times New Roman" w:hAnsi="Times New Roman" w:eastAsia="??"/>
+          <w:rFonts w:ascii="Times New Roman" w:hAnsi="Times New Roman" w:eastAsia="宋体"/>
+          <w:b w:val="0"/>
           <w:sz w:val="22"/>
         </w:rPr>
         <w:t>讲述逻辑：视频链路满足任务书“3 M以上”的带宽要求，并且缓存没有持续溢出。</w:t>
       </w:r>
     </w:p>
     <w:p>
+      <w:pPr>
+        <w:spacing w:before="120"/>
+      </w:pPr>
       <w:r>
         <w:rPr>
-          <w:rFonts w:ascii="Times New Roman" w:hAnsi="Times New Roman" w:eastAsia="??"/>
+          <w:rFonts w:ascii="Times New Roman" w:hAnsi="Times New Roman" w:eastAsia="宋体"/>
           <w:b/>
-          <w:sz w:val="26"/>
+          <w:sz w:val="25"/>
         </w:rPr>
-        <w:t>第14页：射频链路仿真结果</w:t>
+        <w:t>第15页：射频链路仿真结果</w:t>
       </w:r>
     </w:p>
     <w:p>
+      <w:pPr>
+        <w:spacing w:line="324" w:lineRule="auto" w:after="80"/>
+        <w:ind w:firstLine="440"/>
+      </w:pPr>
       <w:r>
         <w:rPr>
-          <w:rFonts w:ascii="Times New Roman" w:hAnsi="Times New Roman" w:eastAsia="??"/>
+          <w:rFonts w:ascii="Times New Roman" w:hAnsi="Times New Roman" w:eastAsia="宋体"/>
+          <w:b w:val="0"/>
           <w:sz w:val="22"/>
         </w:rPr>
         <w:t>建议放图：`rf_link_ber.png`</w:t>
       </w:r>
     </w:p>
     <w:p>
+      <w:pPr>
+        <w:spacing w:line="324" w:lineRule="auto" w:after="80"/>
+        <w:ind w:firstLine="440"/>
+      </w:pPr>
       <w:r>
         <w:rPr>
-          <w:rFonts w:ascii="Times New Roman" w:hAnsi="Times New Roman" w:eastAsia="??"/>
+          <w:rFonts w:ascii="Times New Roman" w:hAnsi="Times New Roman" w:eastAsia="宋体"/>
+          <w:b w:val="0"/>
           <w:sz w:val="22"/>
         </w:rPr>
         <w:t>重点数据：</w:t>
@@ -1186,10 +1695,12 @@
     <w:p>
       <w:pPr>
         <w:pStyle w:val="ListBullet"/>
+        <w:spacing w:line="324" w:lineRule="auto" w:after="80"/>
       </w:pPr>
       <w:r>
         <w:rPr>
-          <w:rFonts w:ascii="Times New Roman" w:hAnsi="Times New Roman" w:eastAsia="??"/>
+          <w:rFonts w:ascii="Times New Roman" w:hAnsi="Times New Roman" w:eastAsia="宋体"/>
+          <w:b w:val="0"/>
           <w:sz w:val="22"/>
         </w:rPr>
         <w:t>距离条件：10 km</w:t>
@@ -1198,10 +1709,12 @@
     <w:p>
       <w:pPr>
         <w:pStyle w:val="ListBullet"/>
+        <w:spacing w:line="324" w:lineRule="auto" w:after="80"/>
       </w:pPr>
       <w:r>
         <w:rPr>
-          <w:rFonts w:ascii="Times New Roman" w:hAnsi="Times New Roman" w:eastAsia="??"/>
+          <w:rFonts w:ascii="Times New Roman" w:hAnsi="Times New Roman" w:eastAsia="宋体"/>
+          <w:b w:val="0"/>
           <w:sz w:val="22"/>
         </w:rPr>
         <w:t>最低控制信道 SNR：61.56 dB</w:t>
@@ -1210,10 +1723,12 @@
     <w:p>
       <w:pPr>
         <w:pStyle w:val="ListBullet"/>
+        <w:spacing w:line="324" w:lineRule="auto" w:after="80"/>
       </w:pPr>
       <w:r>
         <w:rPr>
-          <w:rFonts w:ascii="Times New Roman" w:hAnsi="Times New Roman" w:eastAsia="??"/>
+          <w:rFonts w:ascii="Times New Roman" w:hAnsi="Times New Roman" w:eastAsia="宋体"/>
+          <w:b w:val="0"/>
           <w:sz w:val="22"/>
         </w:rPr>
         <w:t>最低视频信道 SNR：44.76 dB</w:t>
@@ -1222,85 +1737,120 @@
     <w:p>
       <w:pPr>
         <w:pStyle w:val="ListBullet"/>
+        <w:spacing w:line="324" w:lineRule="auto" w:after="80"/>
       </w:pPr>
       <w:r>
         <w:rPr>
-          <w:rFonts w:ascii="Times New Roman" w:hAnsi="Times New Roman" w:eastAsia="??"/>
+          <w:rFonts w:ascii="Times New Roman" w:hAnsi="Times New Roman" w:eastAsia="宋体"/>
+          <w:b w:val="0"/>
           <w:sz w:val="22"/>
         </w:rPr>
         <w:t>BER 曲线用于观察调制可靠性。</w:t>
       </w:r>
     </w:p>
     <w:p>
+      <w:pPr>
+        <w:spacing w:line="324" w:lineRule="auto" w:after="80"/>
+        <w:ind w:firstLine="440"/>
+      </w:pPr>
       <w:r>
         <w:rPr>
-          <w:rFonts w:ascii="Times New Roman" w:hAnsi="Times New Roman" w:eastAsia="??"/>
+          <w:rFonts w:ascii="Times New Roman" w:hAnsi="Times New Roman" w:eastAsia="宋体"/>
+          <w:b w:val="0"/>
           <w:sz w:val="22"/>
         </w:rPr>
         <w:t>注意：这是软件链路预算，不是外场实测。PPT中必须说清楚。</w:t>
       </w:r>
     </w:p>
     <w:p>
+      <w:pPr>
+        <w:spacing w:before="120"/>
+      </w:pPr>
       <w:r>
         <w:rPr>
-          <w:rFonts w:ascii="Times New Roman" w:hAnsi="Times New Roman" w:eastAsia="??"/>
+          <w:rFonts w:ascii="Times New Roman" w:hAnsi="Times New Roman" w:eastAsia="宋体"/>
           <w:b/>
-          <w:sz w:val="26"/>
+          <w:sz w:val="25"/>
         </w:rPr>
-        <w:t>第15页：结论</w:t>
+        <w:t>第16页：结论</w:t>
       </w:r>
     </w:p>
     <w:p>
+      <w:pPr>
+        <w:spacing w:line="324" w:lineRule="auto" w:after="80"/>
+        <w:ind w:firstLine="440"/>
+      </w:pPr>
       <w:r>
         <w:rPr>
-          <w:rFonts w:ascii="Times New Roman" w:hAnsi="Times New Roman" w:eastAsia="??"/>
+          <w:rFonts w:ascii="Times New Roman" w:hAnsi="Times New Roman" w:eastAsia="宋体"/>
+          <w:b w:val="0"/>
           <w:sz w:val="22"/>
         </w:rPr>
         <w:t>建议用三条结论：</w:t>
       </w:r>
     </w:p>
     <w:p>
+      <w:pPr>
+        <w:spacing w:line="324" w:lineRule="auto" w:after="80"/>
+      </w:pPr>
       <w:r>
         <w:rPr>
-          <w:rFonts w:ascii="Times New Roman" w:hAnsi="Times New Roman" w:eastAsia="??"/>
+          <w:rFonts w:ascii="Times New Roman" w:hAnsi="Times New Roman" w:eastAsia="宋体"/>
+          <w:b w:val="0"/>
           <w:sz w:val="22"/>
         </w:rPr>
         <w:t>1. 完成了机器人端电机控制、视频采集和射频链路的系统级设计。</w:t>
       </w:r>
     </w:p>
     <w:p>
+      <w:pPr>
+        <w:spacing w:line="324" w:lineRule="auto" w:after="80"/>
+      </w:pPr>
       <w:r>
         <w:rPr>
-          <w:rFonts w:ascii="Times New Roman" w:hAnsi="Times New Roman" w:eastAsia="??"/>
+          <w:rFonts w:ascii="Times New Roman" w:hAnsi="Times New Roman" w:eastAsia="宋体"/>
+          <w:b w:val="0"/>
           <w:sz w:val="22"/>
         </w:rPr>
-        <w:t>2. 建立了分层 MATLAB/Simulink 模型，并生成可复现实验结果。</w:t>
+        <w:t>2. 基于 MATLAB R2025a、Simulink Agentic Toolkit 和分层模型生成了可复现实验结果。</w:t>
       </w:r>
     </w:p>
     <w:p>
+      <w:pPr>
+        <w:spacing w:line="324" w:lineRule="auto" w:after="80"/>
+      </w:pPr>
       <w:r>
         <w:rPr>
-          <w:rFonts w:ascii="Times New Roman" w:hAnsi="Times New Roman" w:eastAsia="??"/>
+          <w:rFonts w:ascii="Times New Roman" w:hAnsi="Times New Roman" w:eastAsia="宋体"/>
+          <w:b w:val="0"/>
           <w:sz w:val="22"/>
         </w:rPr>
         <w:t>3. 仿真表明方案在给定模型参数下满足电机响应、视频带宽和射频链路预算要求。</w:t>
       </w:r>
     </w:p>
     <w:p>
+      <w:pPr>
+        <w:spacing w:line="324" w:lineRule="auto" w:after="80"/>
+        <w:ind w:firstLine="440"/>
+      </w:pPr>
       <w:r>
         <w:rPr>
-          <w:rFonts w:ascii="Times New Roman" w:hAnsi="Times New Roman" w:eastAsia="??"/>
+          <w:rFonts w:ascii="Times New Roman" w:hAnsi="Times New Roman" w:eastAsia="宋体"/>
+          <w:b w:val="0"/>
           <w:sz w:val="22"/>
         </w:rPr>
         <w:t>最后一句建议：后续工作是进行硬件在环测试、真实电机测试和射频外场测试。</w:t>
       </w:r>
     </w:p>
     <w:p>
+      <w:pPr>
+        <w:spacing w:before="160"/>
+      </w:pPr>
       <w:r>
         <w:rPr>
-          <w:rFonts w:ascii="Times New Roman" w:hAnsi="Times New Roman" w:eastAsia="??"/>
+          <w:rFonts w:ascii="Times New Roman" w:hAnsi="Times New Roman" w:eastAsia="宋体"/>
           <w:b/>
-          <w:sz w:val="30"/>
+          <w:sz w:val="28"/>
         </w:rPr>
         <w:t>3. PPT中必须避免的错误</w:t>
       </w:r>
@@ -1308,10 +1858,12 @@
     <w:p>
       <w:pPr>
         <w:pStyle w:val="ListBullet"/>
+        <w:spacing w:line="324" w:lineRule="auto" w:after="80"/>
       </w:pPr>
       <w:r>
         <w:rPr>
-          <w:rFonts w:ascii="Times New Roman" w:hAnsi="Times New Roman" w:eastAsia="??"/>
+          <w:rFonts w:ascii="Times New Roman" w:hAnsi="Times New Roman" w:eastAsia="宋体"/>
+          <w:b w:val="0"/>
           <w:sz w:val="22"/>
         </w:rPr>
         <w:t>不要说已经完成真实硬件测试。</w:t>
@@ -1320,10 +1872,12 @@
     <w:p>
       <w:pPr>
         <w:pStyle w:val="ListBullet"/>
+        <w:spacing w:line="324" w:lineRule="auto" w:after="80"/>
       </w:pPr>
       <w:r>
         <w:rPr>
-          <w:rFonts w:ascii="Times New Roman" w:hAnsi="Times New Roman" w:eastAsia="??"/>
+          <w:rFonts w:ascii="Times New Roman" w:hAnsi="Times New Roman" w:eastAsia="宋体"/>
+          <w:b w:val="0"/>
           <w:sz w:val="22"/>
         </w:rPr>
         <w:t>不要说已经完成 10 km 外场通信实验。</w:t>
@@ -1332,10 +1886,12 @@
     <w:p>
       <w:pPr>
         <w:pStyle w:val="ListBullet"/>
+        <w:spacing w:line="324" w:lineRule="auto" w:after="80"/>
       </w:pPr>
       <w:r>
         <w:rPr>
-          <w:rFonts w:ascii="Times New Roman" w:hAnsi="Times New Roman" w:eastAsia="??"/>
+          <w:rFonts w:ascii="Times New Roman" w:hAnsi="Times New Roman" w:eastAsia="宋体"/>
+          <w:b w:val="0"/>
           <w:sz w:val="22"/>
         </w:rPr>
         <w:t>不要说 DSP 独立完成 H.264 视频压缩。</w:t>
@@ -1344,10 +1900,12 @@
     <w:p>
       <w:pPr>
         <w:pStyle w:val="ListBullet"/>
+        <w:spacing w:line="324" w:lineRule="auto" w:after="80"/>
       </w:pPr>
       <w:r>
         <w:rPr>
-          <w:rFonts w:ascii="Times New Roman" w:hAnsi="Times New Roman" w:eastAsia="??"/>
+          <w:rFonts w:ascii="Times New Roman" w:hAnsi="Times New Roman" w:eastAsia="宋体"/>
+          <w:b w:val="0"/>
           <w:sz w:val="22"/>
         </w:rPr>
         <w:t>不要把仿真图说成示波器实测图。</w:t>
@@ -1356,10 +1914,12 @@
     <w:p>
       <w:pPr>
         <w:pStyle w:val="ListBullet"/>
+        <w:spacing w:line="324" w:lineRule="auto" w:after="80"/>
       </w:pPr>
       <w:r>
         <w:rPr>
-          <w:rFonts w:ascii="Times New Roman" w:hAnsi="Times New Roman" w:eastAsia="??"/>
+          <w:rFonts w:ascii="Times New Roman" w:hAnsi="Times New Roman" w:eastAsia="宋体"/>
+          <w:b w:val="0"/>
           <w:sz w:val="22"/>
         </w:rPr>
         <w:t>不要删掉“MATLAB/Simulink 仿真”这个边界。</w:t>
@@ -1368,21 +1928,26 @@
     <w:p>
       <w:pPr>
         <w:pStyle w:val="ListBullet"/>
+        <w:spacing w:line="324" w:lineRule="auto" w:after="80"/>
       </w:pPr>
       <w:r>
         <w:rPr>
-          <w:rFonts w:ascii="Times New Roman" w:hAnsi="Times New Roman" w:eastAsia="??"/>
+          <w:rFonts w:ascii="Times New Roman" w:hAnsi="Times New Roman" w:eastAsia="宋体"/>
+          <w:b w:val="0"/>
           <w:sz w:val="22"/>
         </w:rPr>
         <w:t>不要把报告中的数据手动改成更好看的数值。</w:t>
       </w:r>
     </w:p>
     <w:p>
+      <w:pPr>
+        <w:spacing w:before="160"/>
+      </w:pPr>
       <w:r>
         <w:rPr>
-          <w:rFonts w:ascii="Times New Roman" w:hAnsi="Times New Roman" w:eastAsia="??"/>
+          <w:rFonts w:ascii="Times New Roman" w:hAnsi="Times New Roman" w:eastAsia="宋体"/>
           <w:b/>
-          <w:sz w:val="30"/>
+          <w:sz w:val="28"/>
         </w:rPr>
         <w:t>4. 推荐视觉风格</w:t>
       </w:r>
@@ -1390,10 +1955,12 @@
     <w:p>
       <w:pPr>
         <w:pStyle w:val="ListBullet"/>
+        <w:spacing w:line="324" w:lineRule="auto" w:after="80"/>
       </w:pPr>
       <w:r>
         <w:rPr>
-          <w:rFonts w:ascii="Times New Roman" w:hAnsi="Times New Roman" w:eastAsia="??"/>
+          <w:rFonts w:ascii="Times New Roman" w:hAnsi="Times New Roman" w:eastAsia="宋体"/>
+          <w:b w:val="0"/>
           <w:sz w:val="22"/>
         </w:rPr>
         <w:t>每页标题控制在 12 个字左右。</w:t>
@@ -1402,10 +1969,12 @@
     <w:p>
       <w:pPr>
         <w:pStyle w:val="ListBullet"/>
+        <w:spacing w:line="324" w:lineRule="auto" w:after="80"/>
       </w:pPr>
       <w:r>
         <w:rPr>
-          <w:rFonts w:ascii="Times New Roman" w:hAnsi="Times New Roman" w:eastAsia="??"/>
+          <w:rFonts w:ascii="Times New Roman" w:hAnsi="Times New Roman" w:eastAsia="宋体"/>
+          <w:b w:val="0"/>
           <w:sz w:val="22"/>
         </w:rPr>
         <w:t>每页正文不超过 4 行。</w:t>
@@ -1414,10 +1983,12 @@
     <w:p>
       <w:pPr>
         <w:pStyle w:val="ListBullet"/>
+        <w:spacing w:line="324" w:lineRule="auto" w:after="80"/>
       </w:pPr>
       <w:r>
         <w:rPr>
-          <w:rFonts w:ascii="Times New Roman" w:hAnsi="Times New Roman" w:eastAsia="??"/>
+          <w:rFonts w:ascii="Times New Roman" w:hAnsi="Times New Roman" w:eastAsia="宋体"/>
+          <w:b w:val="0"/>
           <w:sz w:val="22"/>
         </w:rPr>
         <w:t>图放大，文字少写。</w:t>
@@ -1426,10 +1997,12 @@
     <w:p>
       <w:pPr>
         <w:pStyle w:val="ListBullet"/>
+        <w:spacing w:line="324" w:lineRule="auto" w:after="80"/>
       </w:pPr>
       <w:r>
         <w:rPr>
-          <w:rFonts w:ascii="Times New Roman" w:hAnsi="Times New Roman" w:eastAsia="??"/>
+          <w:rFonts w:ascii="Times New Roman" w:hAnsi="Times New Roman" w:eastAsia="宋体"/>
+          <w:b w:val="0"/>
           <w:sz w:val="22"/>
         </w:rPr>
         <w:t>曲线图尽量直接使用 `output/figures/` 中的 PNG。</w:t>
@@ -1438,37 +2011,47 @@
     <w:p>
       <w:pPr>
         <w:pStyle w:val="ListBullet"/>
+        <w:spacing w:line="324" w:lineRule="auto" w:after="80"/>
       </w:pPr>
       <w:r>
         <w:rPr>
-          <w:rFonts w:ascii="Times New Roman" w:hAnsi="Times New Roman" w:eastAsia="??"/>
+          <w:rFonts w:ascii="Times New Roman" w:hAnsi="Times New Roman" w:eastAsia="宋体"/>
+          <w:b w:val="0"/>
           <w:sz w:val="22"/>
         </w:rPr>
         <w:t>颜色不要过多，保持白底、深色文字、蓝/橙/绿等少量强调色。</w:t>
       </w:r>
     </w:p>
     <w:p>
+      <w:pPr>
+        <w:spacing w:before="160"/>
+      </w:pPr>
       <w:r>
         <w:rPr>
-          <w:rFonts w:ascii="Times New Roman" w:hAnsi="Times New Roman" w:eastAsia="??"/>
+          <w:rFonts w:ascii="Times New Roman" w:hAnsi="Times New Roman" w:eastAsia="宋体"/>
           <w:b/>
-          <w:sz w:val="30"/>
+          <w:sz w:val="28"/>
         </w:rPr>
         <w:t>5. 一句话汇报主线</w:t>
       </w:r>
     </w:p>
     <w:p>
+      <w:pPr>
+        <w:spacing w:line="324" w:lineRule="auto" w:after="80"/>
+        <w:ind w:firstLine="440"/>
+      </w:pPr>
       <w:r>
         <w:rPr>
-          <w:rFonts w:ascii="Times New Roman" w:hAnsi="Times New Roman" w:eastAsia="??"/>
+          <w:rFonts w:ascii="Times New Roman" w:hAnsi="Times New Roman" w:eastAsia="宋体"/>
+          <w:b w:val="0"/>
           <w:sz w:val="22"/>
         </w:rPr>
-        <w:t>本设计用 TMS320F28379D 作为机器人端 DSP 主控，通过 MATLAB/Simulink 建立电机控制、视频传输和 VHF 射频链路的分层仿真模型，并用真实生成的数据验证了系统在控制响应、视频带宽和通信链路预算方面的可行性。</w:t>
+        <w:t>本设计用 TMS320F28379D 作为机器人端 DSP 主控，通过 MATLAB R2025a/Simulink 建立电机控制、视频传输和 VHF 射频链路的分层仿真模型，并用真实生成的数据验证了系统在控制响应、视频带宽和通信链路预算方面的可行性。</w:t>
       </w:r>
     </w:p>
     <w:sectPr>
-      <w:pgSz w:w="12240" w:h="15840"/>
-      <w:pgMar w:top="1440" w:right="1800" w:bottom="1440" w:left="1800" w:header="720" w:footer="720" w:gutter="0"/>
+      <w:pgSz w:w="11906" w:h="16838"/>
+      <w:pgMar w:top="1440" w:right="1803" w:bottom="1440" w:left="1803" w:header="720" w:footer="720" w:gutter="0"/>
       <w:cols w:space="720"/>
       <w:docGrid w:linePitch="360"/>
     </w:sectPr>

</xml_diff>